<commit_message>
Reescreve manual como guia do usuário simplificado (ABNT)
Remove explicações matemáticas dos métodos e foca em como usar
a interface: passo a passo por módulo, descrição dos parâmetros
de entrada e do assistente Clark Calc.

https://claude.ai/code/session_0185Jy6aEfCJtjc3xKcGy5HJ
</commit_message>
<xml_diff>
--- a/manual_supermath_abnt.docx
+++ b/manual_supermath_abnt.docx
@@ -12,6 +12,7 @@
         <w:rPr>
           <w:rFonts w:ascii="Arial" w:hAnsi="Arial"/>
           <w:b/>
+          <w:i w:val="0"/>
           <w:sz w:val="24"/>
         </w:rPr>
         <w:t>CENTRO UNIVERSITÁRIO SAGRADO CORAÇÃO — UNISAGRADO</w:t>
@@ -27,6 +28,7 @@
         <w:rPr>
           <w:rFonts w:ascii="Arial" w:hAnsi="Arial"/>
           <w:b/>
+          <w:i w:val="0"/>
           <w:sz w:val="24"/>
         </w:rPr>
         <w:t>CURSO DE CIÊNCIA DA COMPUTAÇÃO</w:t>
@@ -36,6 +38,8 @@
     <w:p/>
     <w:p/>
     <w:p/>
+    <w:p/>
+    <w:p/>
     <w:p>
       <w:pPr>
         <w:spacing w:before="0" w:after="0" w:line="360" w:lineRule="auto"/>
@@ -46,6 +50,7 @@
         <w:rPr>
           <w:rFonts w:ascii="Arial" w:hAnsi="Arial"/>
           <w:b/>
+          <w:i w:val="0"/>
           <w:sz w:val="32"/>
         </w:rPr>
         <w:t>SUPERMATH</w:t>
@@ -61,30 +66,19 @@
         <w:rPr>
           <w:rFonts w:ascii="Arial" w:hAnsi="Arial"/>
           <w:b w:val="0"/>
+          <w:i w:val="0"/>
           <w:sz w:val="28"/>
         </w:rPr>
         <w:t>Manual do Usuário</w:t>
-      </w:r>
-    </w:p>
-    <w:p>
-      <w:pPr>
-        <w:spacing w:before="60" w:after="0" w:line="360" w:lineRule="auto"/>
-        <w:ind w:firstLine="0"/>
-        <w:jc w:val="center"/>
-      </w:pPr>
-      <w:r>
-        <w:rPr>
-          <w:rFonts w:ascii="Arial" w:hAnsi="Arial"/>
-          <w:b w:val="0"/>
-          <w:sz w:val="24"/>
-        </w:rPr>
-        <w:t>Calculadora de Computação Numérica</w:t>
       </w:r>
     </w:p>
     <w:p/>
     <w:p/>
     <w:p/>
     <w:p/>
+    <w:p/>
+    <w:p/>
+    <w:p/>
     <w:p>
       <w:pPr>
         <w:spacing w:before="0" w:after="0" w:line="360" w:lineRule="auto"/>
@@ -95,6 +89,7 @@
         <w:rPr>
           <w:rFonts w:ascii="Arial" w:hAnsi="Arial"/>
           <w:b w:val="0"/>
+          <w:i w:val="0"/>
           <w:sz w:val="24"/>
         </w:rPr>
         <w:t>Disciplina: Computação Numérica</w:t>
@@ -110,13 +105,13 @@
         <w:rPr>
           <w:rFonts w:ascii="Arial" w:hAnsi="Arial"/>
           <w:b w:val="0"/>
+          <w:i w:val="0"/>
           <w:sz w:val="24"/>
         </w:rPr>
         <w:t>Professor: Me. Guilherme Biazzi Gonçalves</w:t>
       </w:r>
     </w:p>
     <w:p/>
-    <w:p/>
     <w:p>
       <w:pPr>
         <w:spacing w:before="0" w:after="0" w:line="360" w:lineRule="auto"/>
@@ -127,6 +122,7 @@
         <w:rPr>
           <w:rFonts w:ascii="Arial" w:hAnsi="Arial"/>
           <w:b w:val="0"/>
+          <w:i w:val="0"/>
           <w:sz w:val="24"/>
         </w:rPr>
         <w:t>Francine Reimi Honda</w:t>
@@ -142,6 +138,7 @@
         <w:rPr>
           <w:rFonts w:ascii="Arial" w:hAnsi="Arial"/>
           <w:b w:val="0"/>
+          <w:i w:val="0"/>
           <w:sz w:val="24"/>
         </w:rPr>
         <w:t>Gustavo Felipe Bento Lopes</w:t>
@@ -157,6 +154,7 @@
         <w:rPr>
           <w:rFonts w:ascii="Arial" w:hAnsi="Arial"/>
           <w:b w:val="0"/>
+          <w:i w:val="0"/>
           <w:sz w:val="24"/>
         </w:rPr>
         <w:t>João Vitor Camargo</w:t>
@@ -172,6 +170,7 @@
         <w:rPr>
           <w:rFonts w:ascii="Arial" w:hAnsi="Arial"/>
           <w:b w:val="0"/>
+          <w:i w:val="0"/>
           <w:sz w:val="24"/>
         </w:rPr>
         <w:t>Mateus Fernandes da Silva</w:t>
@@ -187,6 +186,7 @@
         <w:rPr>
           <w:rFonts w:ascii="Arial" w:hAnsi="Arial"/>
           <w:b w:val="0"/>
+          <w:i w:val="0"/>
           <w:sz w:val="24"/>
         </w:rPr>
         <w:t>Pedro Antônio Souza Rezende</w:t>
@@ -195,6 +195,7 @@
     <w:p/>
     <w:p/>
     <w:p/>
+    <w:p/>
     <w:p>
       <w:pPr>
         <w:spacing w:before="0" w:after="0" w:line="360" w:lineRule="auto"/>
@@ -205,6 +206,7 @@
         <w:rPr>
           <w:rFonts w:ascii="Arial" w:hAnsi="Arial"/>
           <w:b w:val="0"/>
+          <w:i w:val="0"/>
           <w:sz w:val="24"/>
         </w:rPr>
         <w:t>Bauru — SP</w:t>
@@ -220,6 +222,7 @@
         <w:rPr>
           <w:rFonts w:ascii="Arial" w:hAnsi="Arial"/>
           <w:b w:val="0"/>
+          <w:i w:val="0"/>
           <w:sz w:val="24"/>
         </w:rPr>
         <w:t>2025</w:t>
@@ -242,6 +245,7 @@
         <w:rPr>
           <w:rFonts w:ascii="Arial" w:hAnsi="Arial"/>
           <w:b w:val="0"/>
+          <w:i w:val="0"/>
           <w:sz w:val="24"/>
         </w:rPr>
         <w:t>Francine Reimi Honda</w:t>
@@ -257,6 +261,7 @@
         <w:rPr>
           <w:rFonts w:ascii="Arial" w:hAnsi="Arial"/>
           <w:b w:val="0"/>
+          <w:i w:val="0"/>
           <w:sz w:val="24"/>
         </w:rPr>
         <w:t>Gustavo Felipe Bento Lopes</w:t>
@@ -272,6 +277,7 @@
         <w:rPr>
           <w:rFonts w:ascii="Arial" w:hAnsi="Arial"/>
           <w:b w:val="0"/>
+          <w:i w:val="0"/>
           <w:sz w:val="24"/>
         </w:rPr>
         <w:t>João Vitor Camargo</w:t>
@@ -287,6 +293,7 @@
         <w:rPr>
           <w:rFonts w:ascii="Arial" w:hAnsi="Arial"/>
           <w:b w:val="0"/>
+          <w:i w:val="0"/>
           <w:sz w:val="24"/>
         </w:rPr>
         <w:t>Mateus Fernandes da Silva</w:t>
@@ -302,6 +309,7 @@
         <w:rPr>
           <w:rFonts w:ascii="Arial" w:hAnsi="Arial"/>
           <w:b w:val="0"/>
+          <w:i w:val="0"/>
           <w:sz w:val="24"/>
         </w:rPr>
         <w:t>Pedro Antônio Souza Rezende</w:t>
@@ -310,6 +318,7 @@
     <w:p/>
     <w:p/>
     <w:p/>
+    <w:p/>
     <w:p>
       <w:pPr>
         <w:spacing w:before="0" w:after="0" w:line="360" w:lineRule="auto"/>
@@ -320,6 +329,7 @@
         <w:rPr>
           <w:rFonts w:ascii="Arial" w:hAnsi="Arial"/>
           <w:b/>
+          <w:i w:val="0"/>
           <w:sz w:val="32"/>
         </w:rPr>
         <w:t>SUPERMATH</w:t>
@@ -335,19 +345,21 @@
         <w:rPr>
           <w:rFonts w:ascii="Arial" w:hAnsi="Arial"/>
           <w:b w:val="0"/>
-          <w:sz w:val="24"/>
+          <w:i w:val="0"/>
+          <w:sz w:val="28"/>
         </w:rPr>
-        <w:t>Manual do Usuário — Calculadora de Computação Numérica</w:t>
+        <w:t>Manual do Usuário</w:t>
       </w:r>
     </w:p>
     <w:p/>
     <w:p/>
     <w:p/>
+    <w:p/>
     <w:p>
       <w:pPr>
         <w:spacing w:before="0" w:after="0" w:line="360" w:lineRule="auto"/>
         <w:ind w:left="4535" w:firstLine="0"/>
-        <w:jc w:val="left"/>
+        <w:jc w:val="both"/>
       </w:pPr>
       <w:r>
         <w:rPr>
@@ -364,6 +376,7 @@
     <w:p/>
     <w:p/>
     <w:p/>
+    <w:p/>
     <w:p>
       <w:pPr>
         <w:spacing w:before="0" w:after="0" w:line="360" w:lineRule="auto"/>
@@ -374,6 +387,7 @@
         <w:rPr>
           <w:rFonts w:ascii="Arial" w:hAnsi="Arial"/>
           <w:b w:val="0"/>
+          <w:i w:val="0"/>
           <w:sz w:val="24"/>
         </w:rPr>
         <w:t>Bauru — SP</w:t>
@@ -389,6 +403,7 @@
         <w:rPr>
           <w:rFonts w:ascii="Arial" w:hAnsi="Arial"/>
           <w:b w:val="0"/>
+          <w:i w:val="0"/>
           <w:sz w:val="24"/>
         </w:rPr>
         <w:t>2025</w:t>
@@ -401,7 +416,7 @@
     </w:p>
     <w:p>
       <w:pPr>
-        <w:spacing w:before="240" w:after="120" w:line="360" w:lineRule="auto"/>
+        <w:spacing w:before="360" w:after="120" w:line="360" w:lineRule="auto"/>
         <w:ind w:firstLine="0"/>
         <w:jc w:val="left"/>
       </w:pPr>
@@ -409,6 +424,7 @@
         <w:rPr>
           <w:rFonts w:ascii="Arial" w:hAnsi="Arial"/>
           <w:b/>
+          <w:i w:val="0"/>
           <w:sz w:val="24"/>
         </w:rPr>
         <w:t>SUMÁRIO</w:t>
@@ -416,7 +432,7 @@
     </w:p>
     <w:p>
       <w:pPr>
-        <w:spacing w:before="0" w:after="0" w:line="360" w:lineRule="auto"/>
+        <w:spacing w:before="0" w:after="0" w:line="240" w:lineRule="auto"/>
         <w:ind w:firstLine="0"/>
         <w:jc w:val="left"/>
       </w:pPr>
@@ -424,6 +440,7 @@
         <w:rPr>
           <w:rFonts w:ascii="Arial" w:hAnsi="Arial"/>
           <w:b/>
+          <w:i w:val="0"/>
           <w:sz w:val="24"/>
         </w:rPr>
         <w:t>1  INTRODUÇÃO</w:t>
@@ -431,7 +448,7 @@
     </w:p>
     <w:p>
       <w:pPr>
-        <w:spacing w:before="0" w:after="0" w:line="360" w:lineRule="auto"/>
+        <w:spacing w:before="0" w:after="0" w:line="240" w:lineRule="auto"/>
         <w:ind w:firstLine="0"/>
         <w:jc w:val="left"/>
       </w:pPr>
@@ -439,14 +456,15 @@
         <w:rPr>
           <w:rFonts w:ascii="Arial" w:hAnsi="Arial"/>
           <w:b/>
+          <w:i w:val="0"/>
           <w:sz w:val="24"/>
         </w:rPr>
-        <w:t>2  VISÃO GERAL DA INTERFACE</w:t>
+        <w:t>2  ACESSO AO SISTEMA</w:t>
       </w:r>
     </w:p>
     <w:p>
       <w:pPr>
-        <w:spacing w:before="0" w:after="0" w:line="360" w:lineRule="auto"/>
+        <w:spacing w:before="0" w:after="0" w:line="240" w:lineRule="auto"/>
         <w:ind w:firstLine="0"/>
         <w:jc w:val="left"/>
       </w:pPr>
@@ -454,14 +472,31 @@
         <w:rPr>
           <w:rFonts w:ascii="Arial" w:hAnsi="Arial"/>
           <w:b/>
+          <w:i w:val="0"/>
           <w:sz w:val="24"/>
         </w:rPr>
-        <w:t>3  MÓDULO: RAÍZES DE FUNÇÕES</w:t>
+        <w:t>3  INTERFACE PRINCIPAL</w:t>
       </w:r>
     </w:p>
     <w:p>
       <w:pPr>
-        <w:spacing w:before="0" w:after="0" w:line="360" w:lineRule="auto"/>
+        <w:spacing w:before="0" w:after="0" w:line="240" w:lineRule="auto"/>
+        <w:ind w:firstLine="0"/>
+        <w:jc w:val="left"/>
+      </w:pPr>
+      <w:r>
+        <w:rPr>
+          <w:rFonts w:ascii="Arial" w:hAnsi="Arial"/>
+          <w:b/>
+          <w:i w:val="0"/>
+          <w:sz w:val="24"/>
+        </w:rPr>
+        <w:t>4  MÓDULO: RAÍZES DE FUNÇÕES</w:t>
+      </w:r>
+    </w:p>
+    <w:p>
+      <w:pPr>
+        <w:spacing w:before="0" w:after="0" w:line="240" w:lineRule="auto"/>
         <w:ind w:firstLine="0"/>
         <w:jc w:val="left"/>
       </w:pPr>
@@ -469,14 +504,15 @@
         <w:rPr>
           <w:rFonts w:ascii="Arial" w:hAnsi="Arial"/>
           <w:b w:val="0"/>
+          <w:i w:val="0"/>
           <w:sz w:val="24"/>
         </w:rPr>
-        <w:t>3.1  Bisseção</w:t>
+        <w:t>4.1    Como usar</w:t>
       </w:r>
     </w:p>
     <w:p>
       <w:pPr>
-        <w:spacing w:before="0" w:after="0" w:line="360" w:lineRule="auto"/>
+        <w:spacing w:before="0" w:after="0" w:line="240" w:lineRule="auto"/>
         <w:ind w:firstLine="0"/>
         <w:jc w:val="left"/>
       </w:pPr>
@@ -484,14 +520,31 @@
         <w:rPr>
           <w:rFonts w:ascii="Arial" w:hAnsi="Arial"/>
           <w:b w:val="0"/>
+          <w:i w:val="0"/>
           <w:sz w:val="24"/>
         </w:rPr>
-        <w:t>3.2  Ponto Fixo</w:t>
+        <w:t>4.2    Métodos disponíveis</w:t>
       </w:r>
     </w:p>
     <w:p>
       <w:pPr>
-        <w:spacing w:before="0" w:after="0" w:line="360" w:lineRule="auto"/>
+        <w:spacing w:before="0" w:after="0" w:line="240" w:lineRule="auto"/>
+        <w:ind w:firstLine="0"/>
+        <w:jc w:val="left"/>
+      </w:pPr>
+      <w:r>
+        <w:rPr>
+          <w:rFonts w:ascii="Arial" w:hAnsi="Arial"/>
+          <w:b/>
+          <w:i w:val="0"/>
+          <w:sz w:val="24"/>
+        </w:rPr>
+        <w:t>5  MÓDULO: SISTEMAS LINEARES</w:t>
+      </w:r>
+    </w:p>
+    <w:p>
+      <w:pPr>
+        <w:spacing w:before="0" w:after="0" w:line="240" w:lineRule="auto"/>
         <w:ind w:firstLine="0"/>
         <w:jc w:val="left"/>
       </w:pPr>
@@ -499,14 +552,15 @@
         <w:rPr>
           <w:rFonts w:ascii="Arial" w:hAnsi="Arial"/>
           <w:b w:val="0"/>
+          <w:i w:val="0"/>
           <w:sz w:val="24"/>
         </w:rPr>
-        <w:t>3.3  Newton-Raphson</w:t>
+        <w:t>5.1    Como usar</w:t>
       </w:r>
     </w:p>
     <w:p>
       <w:pPr>
-        <w:spacing w:before="0" w:after="0" w:line="360" w:lineRule="auto"/>
+        <w:spacing w:before="0" w:after="0" w:line="240" w:lineRule="auto"/>
         <w:ind w:firstLine="0"/>
         <w:jc w:val="left"/>
       </w:pPr>
@@ -514,14 +568,15 @@
         <w:rPr>
           <w:rFonts w:ascii="Arial" w:hAnsi="Arial"/>
           <w:b w:val="0"/>
+          <w:i w:val="0"/>
           <w:sz w:val="24"/>
         </w:rPr>
-        <w:t>3.4  Secantes</w:t>
+        <w:t>5.2    Métodos disponíveis</w:t>
       </w:r>
     </w:p>
     <w:p>
       <w:pPr>
-        <w:spacing w:before="0" w:after="0" w:line="360" w:lineRule="auto"/>
+        <w:spacing w:before="0" w:after="0" w:line="240" w:lineRule="auto"/>
         <w:ind w:firstLine="0"/>
         <w:jc w:val="left"/>
       </w:pPr>
@@ -529,14 +584,15 @@
         <w:rPr>
           <w:rFonts w:ascii="Arial" w:hAnsi="Arial"/>
           <w:b/>
+          <w:i w:val="0"/>
           <w:sz w:val="24"/>
         </w:rPr>
-        <w:t>4  MÓDULO: SISTEMAS LINEARES</w:t>
+        <w:t>6  MÓDULO: AJUSTE DE CURVAS</w:t>
       </w:r>
     </w:p>
     <w:p>
       <w:pPr>
-        <w:spacing w:before="0" w:after="0" w:line="360" w:lineRule="auto"/>
+        <w:spacing w:before="0" w:after="0" w:line="240" w:lineRule="auto"/>
         <w:ind w:firstLine="0"/>
         <w:jc w:val="left"/>
       </w:pPr>
@@ -544,14 +600,15 @@
         <w:rPr>
           <w:rFonts w:ascii="Arial" w:hAnsi="Arial"/>
           <w:b w:val="0"/>
+          <w:i w:val="0"/>
           <w:sz w:val="24"/>
         </w:rPr>
-        <w:t>4.1  Eliminação de Gauss com Pivoteamento</w:t>
+        <w:t>6.1    Como usar</w:t>
       </w:r>
     </w:p>
     <w:p>
       <w:pPr>
-        <w:spacing w:before="0" w:after="0" w:line="360" w:lineRule="auto"/>
+        <w:spacing w:before="0" w:after="0" w:line="240" w:lineRule="auto"/>
         <w:ind w:firstLine="0"/>
         <w:jc w:val="left"/>
       </w:pPr>
@@ -559,14 +616,31 @@
         <w:rPr>
           <w:rFonts w:ascii="Arial" w:hAnsi="Arial"/>
           <w:b w:val="0"/>
+          <w:i w:val="0"/>
           <w:sz w:val="24"/>
         </w:rPr>
-        <w:t>4.2  Fatoração LU</w:t>
+        <w:t>6.2    Métodos disponíveis</w:t>
       </w:r>
     </w:p>
     <w:p>
       <w:pPr>
-        <w:spacing w:before="0" w:after="0" w:line="360" w:lineRule="auto"/>
+        <w:spacing w:before="0" w:after="0" w:line="240" w:lineRule="auto"/>
+        <w:ind w:firstLine="0"/>
+        <w:jc w:val="left"/>
+      </w:pPr>
+      <w:r>
+        <w:rPr>
+          <w:rFonts w:ascii="Arial" w:hAnsi="Arial"/>
+          <w:b/>
+          <w:i w:val="0"/>
+          <w:sz w:val="24"/>
+        </w:rPr>
+        <w:t>7  ASSISTENTE CLARK CALC</w:t>
+      </w:r>
+    </w:p>
+    <w:p>
+      <w:pPr>
+        <w:spacing w:before="0" w:after="0" w:line="240" w:lineRule="auto"/>
         <w:ind w:firstLine="0"/>
         <w:jc w:val="left"/>
       </w:pPr>
@@ -574,14 +648,15 @@
         <w:rPr>
           <w:rFonts w:ascii="Arial" w:hAnsi="Arial"/>
           <w:b w:val="0"/>
+          <w:i w:val="0"/>
           <w:sz w:val="24"/>
         </w:rPr>
-        <w:t>4.3  Jacobi</w:t>
+        <w:t>7.1    Como acionar</w:t>
       </w:r>
     </w:p>
     <w:p>
       <w:pPr>
-        <w:spacing w:before="0" w:after="0" w:line="360" w:lineRule="auto"/>
+        <w:spacing w:before="0" w:after="0" w:line="240" w:lineRule="auto"/>
         <w:ind w:firstLine="0"/>
         <w:jc w:val="left"/>
       </w:pPr>
@@ -589,14 +664,15 @@
         <w:rPr>
           <w:rFonts w:ascii="Arial" w:hAnsi="Arial"/>
           <w:b w:val="0"/>
+          <w:i w:val="0"/>
           <w:sz w:val="24"/>
         </w:rPr>
-        <w:t>4.4  Gauss-Seidel</w:t>
+        <w:t>7.2    O que ele faz</w:t>
       </w:r>
     </w:p>
     <w:p>
       <w:pPr>
-        <w:spacing w:before="0" w:after="0" w:line="360" w:lineRule="auto"/>
+        <w:spacing w:before="0" w:after="0" w:line="240" w:lineRule="auto"/>
         <w:ind w:firstLine="0"/>
         <w:jc w:val="left"/>
       </w:pPr>
@@ -604,44 +680,15 @@
         <w:rPr>
           <w:rFonts w:ascii="Arial" w:hAnsi="Arial"/>
           <w:b/>
+          <w:i w:val="0"/>
           <w:sz w:val="24"/>
         </w:rPr>
-        <w:t>5  MÓDULO: AJUSTE DE CURVAS</w:t>
+        <w:t>8  EXECUÇÃO LOCAL (OPCIONAL)</w:t>
       </w:r>
     </w:p>
     <w:p>
       <w:pPr>
-        <w:spacing w:before="0" w:after="0" w:line="360" w:lineRule="auto"/>
-        <w:ind w:firstLine="0"/>
-        <w:jc w:val="left"/>
-      </w:pPr>
-      <w:r>
-        <w:rPr>
-          <w:rFonts w:ascii="Arial" w:hAnsi="Arial"/>
-          <w:b w:val="0"/>
-          <w:sz w:val="24"/>
-        </w:rPr>
-        <w:t>5.1  Regressão Linear</w:t>
-      </w:r>
-    </w:p>
-    <w:p>
-      <w:pPr>
-        <w:spacing w:before="0" w:after="0" w:line="360" w:lineRule="auto"/>
-        <w:ind w:firstLine="0"/>
-        <w:jc w:val="left"/>
-      </w:pPr>
-      <w:r>
-        <w:rPr>
-          <w:rFonts w:ascii="Arial" w:hAnsi="Arial"/>
-          <w:b w:val="0"/>
-          <w:sz w:val="24"/>
-        </w:rPr>
-        <w:t>5.2  Mínimos Quadrados Polinomial</w:t>
-      </w:r>
-    </w:p>
-    <w:p>
-      <w:pPr>
-        <w:spacing w:before="0" w:after="0" w:line="360" w:lineRule="auto"/>
+        <w:spacing w:before="0" w:after="0" w:line="240" w:lineRule="auto"/>
         <w:ind w:firstLine="0"/>
         <w:jc w:val="left"/>
       </w:pPr>
@@ -649,99 +696,10 @@
         <w:rPr>
           <w:rFonts w:ascii="Arial" w:hAnsi="Arial"/>
           <w:b/>
+          <w:i w:val="0"/>
           <w:sz w:val="24"/>
         </w:rPr>
-        <w:t>6  ASSISTENTE CLARK CALC</w:t>
-      </w:r>
-    </w:p>
-    <w:p>
-      <w:pPr>
-        <w:spacing w:before="0" w:after="0" w:line="360" w:lineRule="auto"/>
-        <w:ind w:firstLine="0"/>
-        <w:jc w:val="left"/>
-      </w:pPr>
-      <w:r>
-        <w:rPr>
-          <w:rFonts w:ascii="Arial" w:hAnsi="Arial"/>
-          <w:b w:val="0"/>
-          <w:sz w:val="24"/>
-        </w:rPr>
-        <w:t>6.1  Como Acionar</w:t>
-      </w:r>
-    </w:p>
-    <w:p>
-      <w:pPr>
-        <w:spacing w:before="0" w:after="0" w:line="360" w:lineRule="auto"/>
-        <w:ind w:firstLine="0"/>
-        <w:jc w:val="left"/>
-      </w:pPr>
-      <w:r>
-        <w:rPr>
-          <w:rFonts w:ascii="Arial" w:hAnsi="Arial"/>
-          <w:b w:val="0"/>
-          <w:sz w:val="24"/>
-        </w:rPr>
-        <w:t>6.2  Capacidades</w:t>
-      </w:r>
-    </w:p>
-    <w:p>
-      <w:pPr>
-        <w:spacing w:before="0" w:after="0" w:line="360" w:lineRule="auto"/>
-        <w:ind w:firstLine="0"/>
-        <w:jc w:val="left"/>
-      </w:pPr>
-      <w:r>
-        <w:rPr>
-          <w:rFonts w:ascii="Arial" w:hAnsi="Arial"/>
-          <w:b/>
-          <w:sz w:val="24"/>
-        </w:rPr>
-        <w:t>7  EXECUÇÃO LOCAL (OPCIONAL)</w:t>
-      </w:r>
-    </w:p>
-    <w:p>
-      <w:pPr>
-        <w:spacing w:before="0" w:after="0" w:line="360" w:lineRule="auto"/>
-        <w:ind w:firstLine="0"/>
-        <w:jc w:val="left"/>
-      </w:pPr>
-      <w:r>
-        <w:rPr>
-          <w:rFonts w:ascii="Arial" w:hAnsi="Arial"/>
-          <w:b w:val="0"/>
-          <w:sz w:val="24"/>
-        </w:rPr>
-        <w:t>7.1  Pré-requisitos</w:t>
-      </w:r>
-    </w:p>
-    <w:p>
-      <w:pPr>
-        <w:spacing w:before="0" w:after="0" w:line="360" w:lineRule="auto"/>
-        <w:ind w:firstLine="0"/>
-        <w:jc w:val="left"/>
-      </w:pPr>
-      <w:r>
-        <w:rPr>
-          <w:rFonts w:ascii="Arial" w:hAnsi="Arial"/>
-          <w:b w:val="0"/>
-          <w:sz w:val="24"/>
-        </w:rPr>
-        <w:t>7.2  Passos para Execução</w:t>
-      </w:r>
-    </w:p>
-    <w:p>
-      <w:pPr>
-        <w:spacing w:before="0" w:after="0" w:line="360" w:lineRule="auto"/>
-        <w:ind w:firstLine="0"/>
-        <w:jc w:val="left"/>
-      </w:pPr>
-      <w:r>
-        <w:rPr>
-          <w:rFonts w:ascii="Arial" w:hAnsi="Arial"/>
-          <w:b/>
-          <w:sz w:val="24"/>
-        </w:rPr>
-        <w:t>8  EQUIPE DE DESENVOLVIMENTO</w:t>
+        <w:t>9  EQUIPE DE DESENVOLVIMENTO</w:t>
       </w:r>
     </w:p>
     <w:p>
@@ -751,7 +709,7 @@
     </w:p>
     <w:p>
       <w:pPr>
-        <w:spacing w:before="240" w:after="120" w:line="360" w:lineRule="auto"/>
+        <w:spacing w:before="360" w:after="120" w:line="360" w:lineRule="auto"/>
         <w:ind w:firstLine="0"/>
         <w:jc w:val="left"/>
       </w:pPr>
@@ -759,6 +717,7 @@
         <w:rPr>
           <w:rFonts w:ascii="Arial" w:hAnsi="Arial"/>
           <w:b/>
+          <w:i w:val="0"/>
           <w:sz w:val="24"/>
         </w:rPr>
         <w:t>1 INTRODUÇÃO</w:t>
@@ -777,7 +736,7 @@
           <w:i w:val="0"/>
           <w:sz w:val="24"/>
         </w:rPr>
-        <w:t>O SuperMath é uma aplicação web desenvolvida em Python com o framework Streamlit, criada para a disciplina de Computação Numérica do curso de Ciência da Computação do Centro Universitário Sagrado Coração (UNISAGRADO). A ferramenta disponibiliza uma interface interativa para resolução, análise e experimentação com algoritmos clássicos de métodos numéricos, integrando recursos visuais e um assistente de inteligência artificial contextual.</w:t>
+        <w:t>O SuperMath é uma calculadora web de métodos numéricos desenvolvida para a disciplina de Computação Numérica do curso de Ciência da Computação da UNISAGRADO. O sistema permite que o usuário insira dados, execute cálculos e visualize resultados de forma interativa, sem necessidade de instalação ou conhecimento de programação.</w:t>
       </w:r>
     </w:p>
     <w:p>
@@ -793,7 +752,28 @@
           <w:i w:val="0"/>
           <w:sz w:val="24"/>
         </w:rPr>
-        <w:t>O sistema está estruturado em três módulos principais — Raízes de Funções, Sistemas Lineares e Ajuste de Curvas —, cada um implementando ao menos dois métodos numéricos amplamente estudados na área. Adicionalmente, conta com o assistente Clark Calc, alimentado pelo modelo de linguagem Llama 3.3 70B via API do Groq, capaz de ler os dados da sessão em tempo real e fornecer explicações contextuais sobre os resultados calculados.</w:t>
+        <w:t>Este manual descreve como utilizar cada funcionalidade da aplicação.</w:t>
+      </w:r>
+    </w:p>
+    <w:p>
+      <w:r>
+        <w:br w:type="page"/>
+      </w:r>
+    </w:p>
+    <w:p>
+      <w:pPr>
+        <w:spacing w:before="360" w:after="120" w:line="360" w:lineRule="auto"/>
+        <w:ind w:firstLine="0"/>
+        <w:jc w:val="left"/>
+      </w:pPr>
+      <w:r>
+        <w:rPr>
+          <w:rFonts w:ascii="Arial" w:hAnsi="Arial"/>
+          <w:b/>
+          <w:i w:val="0"/>
+          <w:sz w:val="24"/>
+        </w:rPr>
+        <w:t>2 ACESSO AO SISTEMA</w:t>
       </w:r>
     </w:p>
     <w:p>
@@ -809,8 +789,16 @@
           <w:i w:val="0"/>
           <w:sz w:val="24"/>
         </w:rPr>
-        <w:t xml:space="preserve">O sistema está disponível publicamente, sem necessidade de instalação, no endereço: </w:t>
+        <w:t>O SuperMath está disponível publicamente pelo navegador, sem necessidade de instalação:</w:t>
       </w:r>
+    </w:p>
+    <w:p/>
+    <w:p>
+      <w:pPr>
+        <w:spacing w:before="0" w:after="0" w:line="360" w:lineRule="auto"/>
+        <w:ind w:firstLine="0" w:left="709"/>
+        <w:jc w:val="both"/>
+      </w:pPr>
       <w:r>
         <w:rPr>
           <w:rFonts w:ascii="Arial" w:hAnsi="Arial"/>
@@ -820,6 +808,14 @@
         </w:rPr>
         <w:t>https://supermath.streamlit.app/</w:t>
       </w:r>
+    </w:p>
+    <w:p/>
+    <w:p>
+      <w:pPr>
+        <w:spacing w:before="0" w:after="0" w:line="360" w:lineRule="auto"/>
+        <w:ind w:firstLine="709"/>
+        <w:jc w:val="both"/>
+      </w:pPr>
       <w:r>
         <w:rPr>
           <w:rFonts w:ascii="Arial" w:hAnsi="Arial"/>
@@ -827,7 +823,7 @@
           <w:i w:val="0"/>
           <w:sz w:val="24"/>
         </w:rPr>
-        <w:t>.</w:t>
+        <w:t>Basta acessar o endereço acima em qualquer navegador atualizado (Google Chrome, Mozilla Firefox, Microsoft Edge etc.). Para execução local, consulte a Seção 8.</w:t>
       </w:r>
     </w:p>
     <w:p>
@@ -837,7 +833,7 @@
     </w:p>
     <w:p>
       <w:pPr>
-        <w:spacing w:before="240" w:after="120" w:line="360" w:lineRule="auto"/>
+        <w:spacing w:before="360" w:after="120" w:line="360" w:lineRule="auto"/>
         <w:ind w:firstLine="0"/>
         <w:jc w:val="left"/>
       </w:pPr>
@@ -845,9 +841,10 @@
         <w:rPr>
           <w:rFonts w:ascii="Arial" w:hAnsi="Arial"/>
           <w:b/>
+          <w:i w:val="0"/>
           <w:sz w:val="24"/>
         </w:rPr>
-        <w:t>2 VISÃO GERAL DA INTERFACE</w:t>
+        <w:t>3 INTERFACE PRINCIPAL</w:t>
       </w:r>
     </w:p>
     <w:p>
@@ -863,200 +860,14 @@
           <w:i w:val="0"/>
           <w:sz w:val="24"/>
         </w:rPr>
-        <w:t>Ao acessar o SuperMath, o usuário encontra três elementos principais que compõem a interface da aplicação:</w:t>
+        <w:t>A tela do SuperMath é composta por três áreas:</w:t>
       </w:r>
     </w:p>
     <w:p/>
     <w:p>
       <w:pPr>
         <w:spacing w:before="0" w:after="0" w:line="360" w:lineRule="auto"/>
-        <w:ind w:left="709"/>
-        <w:jc w:val="both"/>
-      </w:pPr>
-      <w:r>
-        <w:rPr>
-          <w:rFonts w:ascii="Arial" w:hAnsi="Arial"/>
-          <w:b/>
-          <w:i w:val="0"/>
-          <w:sz w:val="24"/>
-        </w:rPr>
-        <w:t xml:space="preserve">a) </w:t>
-      </w:r>
-      <w:r>
-        <w:rPr>
-          <w:rFonts w:ascii="Arial" w:hAnsi="Arial"/>
-          <w:b w:val="0"/>
-          <w:i w:val="0"/>
-          <w:sz w:val="24"/>
-        </w:rPr>
-        <w:t xml:space="preserve">Barra de navegação: </w:t>
-      </w:r>
-      <w:r>
-        <w:rPr>
-          <w:rFonts w:ascii="Arial" w:hAnsi="Arial"/>
-          <w:b w:val="0"/>
-          <w:i w:val="0"/>
-          <w:sz w:val="24"/>
-        </w:rPr>
-        <w:t>localizada no topo da tela, contendo as abas Raízes de Funções, Sistemas Lineares e Ajuste de Curvas;</w:t>
-      </w:r>
-    </w:p>
-    <w:p>
-      <w:pPr>
-        <w:spacing w:before="0" w:after="0" w:line="360" w:lineRule="auto"/>
-        <w:ind w:left="709"/>
-        <w:jc w:val="both"/>
-      </w:pPr>
-      <w:r>
-        <w:rPr>
-          <w:rFonts w:ascii="Arial" w:hAnsi="Arial"/>
-          <w:b/>
-          <w:i w:val="0"/>
-          <w:sz w:val="24"/>
-        </w:rPr>
-        <w:t xml:space="preserve">b) </w:t>
-      </w:r>
-      <w:r>
-        <w:rPr>
-          <w:rFonts w:ascii="Arial" w:hAnsi="Arial"/>
-          <w:b w:val="0"/>
-          <w:i w:val="0"/>
-          <w:sz w:val="24"/>
-        </w:rPr>
-        <w:t xml:space="preserve">Painel central: </w:t>
-      </w:r>
-      <w:r>
-        <w:rPr>
-          <w:rFonts w:ascii="Arial" w:hAnsi="Arial"/>
-          <w:b w:val="0"/>
-          <w:i w:val="0"/>
-          <w:sz w:val="24"/>
-        </w:rPr>
-        <w:t>área principal onde os parâmetros de cálculo são configurados e os resultados são exibidos;</w:t>
-      </w:r>
-    </w:p>
-    <w:p>
-      <w:pPr>
-        <w:spacing w:before="0" w:after="0" w:line="360" w:lineRule="auto"/>
-        <w:ind w:left="709"/>
-        <w:jc w:val="both"/>
-      </w:pPr>
-      <w:r>
-        <w:rPr>
-          <w:rFonts w:ascii="Arial" w:hAnsi="Arial"/>
-          <w:b/>
-          <w:i w:val="0"/>
-          <w:sz w:val="24"/>
-        </w:rPr>
-        <w:t xml:space="preserve">c) </w:t>
-      </w:r>
-      <w:r>
-        <w:rPr>
-          <w:rFonts w:ascii="Arial" w:hAnsi="Arial"/>
-          <w:b w:val="0"/>
-          <w:i w:val="0"/>
-          <w:sz w:val="24"/>
-        </w:rPr>
-        <w:t xml:space="preserve">Clark Calc: </w:t>
-      </w:r>
-      <w:r>
-        <w:rPr>
-          <w:rFonts w:ascii="Arial" w:hAnsi="Arial"/>
-          <w:b w:val="0"/>
-          <w:i w:val="0"/>
-          <w:sz w:val="24"/>
-        </w:rPr>
-        <w:t>assistente de inteligência artificial disponível na barra lateral esquerda, acessível durante toda a sessão.</w:t>
-      </w:r>
-    </w:p>
-    <w:p/>
-    <w:p>
-      <w:pPr>
-        <w:spacing w:before="60" w:after="120" w:line="360" w:lineRule="auto"/>
-        <w:ind w:firstLine="0"/>
-        <w:jc w:val="center"/>
-      </w:pPr>
-      <w:r>
-        <w:rPr>
-          <w:rFonts w:ascii="Arial" w:hAnsi="Arial"/>
-          <w:b w:val="0"/>
-          <w:sz w:val="20"/>
-        </w:rPr>
-        <w:t>Figura 1 — Tela inicial do SuperMath com o Clark Calc na barra lateral</w:t>
-      </w:r>
-    </w:p>
-    <w:p>
-      <w:pPr>
-        <w:spacing w:before="60" w:after="120" w:line="360" w:lineRule="auto"/>
-        <w:ind w:firstLine="0"/>
-        <w:jc w:val="center"/>
-      </w:pPr>
-      <w:r>
-        <w:rPr>
-          <w:rFonts w:ascii="Arial" w:hAnsi="Arial"/>
-          <w:b w:val="0"/>
-          <w:sz w:val="20"/>
-        </w:rPr>
-        <w:t>Fonte: Os autores (2025)</w:t>
-      </w:r>
-    </w:p>
-    <w:p>
-      <w:r>
-        <w:br w:type="page"/>
-      </w:r>
-    </w:p>
-    <w:p>
-      <w:pPr>
-        <w:spacing w:before="240" w:after="120" w:line="360" w:lineRule="auto"/>
-        <w:ind w:firstLine="0"/>
-        <w:jc w:val="left"/>
-      </w:pPr>
-      <w:r>
-        <w:rPr>
-          <w:rFonts w:ascii="Arial" w:hAnsi="Arial"/>
-          <w:b/>
-          <w:sz w:val="24"/>
-        </w:rPr>
-        <w:t>3 MÓDULO: RAÍZES DE FUNÇÕES</w:t>
-      </w:r>
-    </w:p>
-    <w:p>
-      <w:pPr>
-        <w:spacing w:before="0" w:after="0" w:line="360" w:lineRule="auto"/>
-        <w:ind w:firstLine="709"/>
-        <w:jc w:val="both"/>
-      </w:pPr>
-      <w:r>
-        <w:rPr>
-          <w:rFonts w:ascii="Arial" w:hAnsi="Arial"/>
-          <w:b w:val="0"/>
-          <w:i w:val="0"/>
-          <w:sz w:val="24"/>
-        </w:rPr>
-        <w:t>Este módulo tem como objetivo encontrar as raízes de uma função f(x) = 0, isto é, os valores de x para os quais a função se anula. Estão disponíveis quatro métodos numéricos, cada um com suas características, requisitos e parâmetros específicos.</w:t>
-      </w:r>
-    </w:p>
-    <w:p>
-      <w:pPr>
-        <w:spacing w:before="0" w:after="0" w:line="360" w:lineRule="auto"/>
-        <w:ind w:firstLine="709"/>
-        <w:jc w:val="both"/>
-      </w:pPr>
-      <w:r>
-        <w:rPr>
-          <w:rFonts w:ascii="Arial" w:hAnsi="Arial"/>
-          <w:b w:val="0"/>
-          <w:i w:val="0"/>
-          <w:sz w:val="24"/>
-        </w:rPr>
-        <w:t>Para utilizar qualquer método deste módulo, o procedimento geral é:</w:t>
-      </w:r>
-    </w:p>
-    <w:p/>
-    <w:p>
-      <w:pPr>
-        <w:spacing w:before="0" w:after="0" w:line="360" w:lineRule="auto"/>
-        <w:ind w:left="709"/>
+        <w:ind w:firstLine="0" w:left="709"/>
         <w:jc w:val="both"/>
       </w:pPr>
       <w:r>
@@ -1075,7 +886,7 @@
           <w:i w:val="0"/>
           <w:sz w:val="24"/>
         </w:rPr>
-        <w:t>Selecione o método:</w:t>
+        <w:t>Barra de navegação:</w:t>
       </w:r>
       <w:r>
         <w:rPr>
@@ -1084,13 +895,13 @@
           <w:i w:val="0"/>
           <w:sz w:val="24"/>
         </w:rPr>
-        <w:t xml:space="preserve"> abra o menu suspenso "Escolha o método" e selecione a opção desejada;</w:t>
+        <w:t xml:space="preserve"> localizada no topo, com as abas Raízes de Funções, Sistemas Lineares e Ajuste de Curvas. Clique em uma aba para mudar de módulo;</w:t>
       </w:r>
     </w:p>
     <w:p>
       <w:pPr>
         <w:spacing w:before="0" w:after="0" w:line="360" w:lineRule="auto"/>
-        <w:ind w:left="709"/>
+        <w:ind w:firstLine="0" w:left="709"/>
         <w:jc w:val="both"/>
       </w:pPr>
       <w:r>
@@ -1109,7 +920,7 @@
           <w:i w:val="0"/>
           <w:sz w:val="24"/>
         </w:rPr>
-        <w:t>Informe a função:</w:t>
+        <w:t>Painel central:</w:t>
       </w:r>
       <w:r>
         <w:rPr>
@@ -1118,13 +929,13 @@
           <w:i w:val="0"/>
           <w:sz w:val="24"/>
         </w:rPr>
-        <w:t xml:space="preserve"> digite a expressão no campo "Função f(x)" utilizando notação Python (por exemplo: x**3 - x - 2 representa x³ − x − 2);</w:t>
+        <w:t xml:space="preserve"> área principal onde os dados são inseridos e os resultados são exibidos;</w:t>
       </w:r>
     </w:p>
     <w:p>
       <w:pPr>
         <w:spacing w:before="0" w:after="0" w:line="360" w:lineRule="auto"/>
-        <w:ind w:left="709"/>
+        <w:ind w:firstLine="0" w:left="709"/>
         <w:jc w:val="both"/>
       </w:pPr>
       <w:r>
@@ -1143,7 +954,7 @@
           <w:i w:val="0"/>
           <w:sz w:val="24"/>
         </w:rPr>
-        <w:t>Configure os parâmetros:</w:t>
+        <w:t>Barra lateral (Clark Calc):</w:t>
       </w:r>
       <w:r>
         <w:rPr>
@@ -1152,871 +963,37 @@
           <w:i w:val="0"/>
           <w:sz w:val="24"/>
         </w:rPr>
-        <w:t xml:space="preserve"> preencha os campos específicos do método selecionado;</w:t>
+        <w:t xml:space="preserve"> assistente de inteligência artificial disponível em todos os módulos.</w:t>
       </w:r>
     </w:p>
+    <w:p/>
     <w:p>
       <w:pPr>
-        <w:spacing w:before="0" w:after="0" w:line="360" w:lineRule="auto"/>
-        <w:ind w:left="709"/>
-        <w:jc w:val="both"/>
-      </w:pPr>
-      <w:r>
-        <w:rPr>
-          <w:rFonts w:ascii="Arial" w:hAnsi="Arial"/>
-          <w:b/>
-          <w:i w:val="0"/>
-          <w:sz w:val="24"/>
-        </w:rPr>
-        <w:t xml:space="preserve">d) </w:t>
-      </w:r>
-      <w:r>
-        <w:rPr>
-          <w:rFonts w:ascii="Arial" w:hAnsi="Arial"/>
-          <w:b/>
-          <w:i w:val="0"/>
-          <w:sz w:val="24"/>
-        </w:rPr>
-        <w:t>Execute:</w:t>
-      </w:r>
+        <w:spacing w:before="60" w:after="60" w:line="240" w:lineRule="auto"/>
+        <w:ind w:firstLine="0"/>
+        <w:jc w:val="center"/>
+      </w:pPr>
       <w:r>
         <w:rPr>
           <w:rFonts w:ascii="Arial" w:hAnsi="Arial"/>
           <w:b w:val="0"/>
           <w:i w:val="0"/>
-          <w:sz w:val="24"/>
-        </w:rPr>
-        <w:t xml:space="preserve"> clique no botão "ENCONTRAR RAIZ" para iniciar o cálculo.</w:t>
-      </w:r>
-    </w:p>
-    <w:p/>
-    <w:p>
-      <w:pPr>
-        <w:spacing w:before="60" w:after="120" w:line="360" w:lineRule="auto"/>
-        <w:ind w:firstLine="0"/>
-        <w:jc w:val="center"/>
-      </w:pPr>
-      <w:r>
-        <w:rPr>
-          <w:rFonts w:ascii="Arial" w:hAnsi="Arial"/>
-          <w:b w:val="0"/>
           <w:sz w:val="20"/>
         </w:rPr>
-        <w:t>Figura 2 — Menu suspenso com os quatro métodos disponíveis</w:t>
+        <w:t>Figura 1 — Tela inicial do SuperMath</w:t>
       </w:r>
     </w:p>
     <w:p>
       <w:pPr>
-        <w:spacing w:before="60" w:after="120" w:line="360" w:lineRule="auto"/>
+        <w:spacing w:before="60" w:after="60" w:line="240" w:lineRule="auto"/>
         <w:ind w:firstLine="0"/>
         <w:jc w:val="center"/>
-      </w:pPr>
-      <w:r>
-        <w:rPr>
-          <w:rFonts w:ascii="Arial" w:hAnsi="Arial"/>
-          <w:b w:val="0"/>
-          <w:sz w:val="20"/>
-        </w:rPr>
-        <w:t>Fonte: Os autores (2025)</w:t>
-      </w:r>
-    </w:p>
-    <w:p/>
-    <w:p>
-      <w:pPr>
-        <w:spacing w:before="120" w:after="60" w:line="360" w:lineRule="auto"/>
-        <w:ind w:firstLine="0"/>
-        <w:jc w:val="left"/>
-      </w:pPr>
-      <w:r>
-        <w:rPr>
-          <w:rFonts w:ascii="Arial" w:hAnsi="Arial"/>
-          <w:b/>
-          <w:sz w:val="24"/>
-        </w:rPr>
-        <w:t>3.1 Bisseção</w:t>
-      </w:r>
-    </w:p>
-    <w:p>
-      <w:pPr>
-        <w:spacing w:before="0" w:after="0" w:line="360" w:lineRule="auto"/>
-        <w:ind w:firstLine="709"/>
-        <w:jc w:val="both"/>
       </w:pPr>
       <w:r>
         <w:rPr>
           <w:rFonts w:ascii="Arial" w:hAnsi="Arial"/>
           <w:b w:val="0"/>
           <w:i w:val="0"/>
-          <w:sz w:val="24"/>
-        </w:rPr>
-        <w:t>O método da Bisseção divide repetidamente um intervalo [a, b] ao meio para localizar a raiz da função. Exige que f(a) e f(b) possuam sinais opostos, condição garantida pelo Teorema de Bolzano, que assegura a existência de pelo menos uma raiz no intervalo.</w:t>
-      </w:r>
-    </w:p>
-    <w:p>
-      <w:pPr>
-        <w:spacing w:before="0" w:after="0" w:line="360" w:lineRule="auto"/>
-        <w:ind w:firstLine="709"/>
-        <w:jc w:val="both"/>
-      </w:pPr>
-      <w:r>
-        <w:rPr>
-          <w:rFonts w:ascii="Arial" w:hAnsi="Arial"/>
-          <w:b w:val="0"/>
-          <w:i w:val="0"/>
-          <w:sz w:val="24"/>
-        </w:rPr>
-        <w:t>Os parâmetros necessários são:</w:t>
-      </w:r>
-    </w:p>
-    <w:p>
-      <w:pPr>
-        <w:spacing w:before="0" w:after="0" w:line="360" w:lineRule="auto"/>
-        <w:ind w:left="709"/>
-        <w:jc w:val="both"/>
-      </w:pPr>
-      <w:r>
-        <w:rPr>
-          <w:rFonts w:ascii="Arial" w:hAnsi="Arial"/>
-          <w:b/>
-          <w:i w:val="0"/>
-          <w:sz w:val="24"/>
-        </w:rPr>
-        <w:t xml:space="preserve">a) </w:t>
-      </w:r>
-      <w:r>
-        <w:rPr>
-          <w:rFonts w:ascii="Arial" w:hAnsi="Arial"/>
-          <w:b/>
-          <w:i w:val="0"/>
-          <w:sz w:val="24"/>
-        </w:rPr>
-        <w:t>Intervalo [a, b]:</w:t>
-      </w:r>
-      <w:r>
-        <w:rPr>
-          <w:rFonts w:ascii="Arial" w:hAnsi="Arial"/>
-          <w:b w:val="0"/>
-          <w:i w:val="0"/>
-          <w:sz w:val="24"/>
-        </w:rPr>
-        <w:t xml:space="preserve"> limites do intervalo de busca; a função deve assumir sinais opostos nos dois extremos;</w:t>
-      </w:r>
-    </w:p>
-    <w:p>
-      <w:pPr>
-        <w:spacing w:before="0" w:after="0" w:line="360" w:lineRule="auto"/>
-        <w:ind w:left="709"/>
-        <w:jc w:val="both"/>
-      </w:pPr>
-      <w:r>
-        <w:rPr>
-          <w:rFonts w:ascii="Arial" w:hAnsi="Arial"/>
-          <w:b/>
-          <w:i w:val="0"/>
-          <w:sz w:val="24"/>
-        </w:rPr>
-        <w:t xml:space="preserve">b) </w:t>
-      </w:r>
-      <w:r>
-        <w:rPr>
-          <w:rFonts w:ascii="Arial" w:hAnsi="Arial"/>
-          <w:b/>
-          <w:i w:val="0"/>
-          <w:sz w:val="24"/>
-        </w:rPr>
-        <w:t>Tolerância:</w:t>
-      </w:r>
-      <w:r>
-        <w:rPr>
-          <w:rFonts w:ascii="Arial" w:hAnsi="Arial"/>
-          <w:b w:val="0"/>
-          <w:i w:val="0"/>
-          <w:sz w:val="24"/>
-        </w:rPr>
-        <w:t xml:space="preserve"> critério de parada; o algoritmo é encerrado quando a amplitude do intervalo for inferior a este valor;</w:t>
-      </w:r>
-    </w:p>
-    <w:p>
-      <w:pPr>
-        <w:spacing w:before="0" w:after="0" w:line="360" w:lineRule="auto"/>
-        <w:ind w:left="709"/>
-        <w:jc w:val="both"/>
-      </w:pPr>
-      <w:r>
-        <w:rPr>
-          <w:rFonts w:ascii="Arial" w:hAnsi="Arial"/>
-          <w:b/>
-          <w:i w:val="0"/>
-          <w:sz w:val="24"/>
-        </w:rPr>
-        <w:t xml:space="preserve">c) </w:t>
-      </w:r>
-      <w:r>
-        <w:rPr>
-          <w:rFonts w:ascii="Arial" w:hAnsi="Arial"/>
-          <w:b/>
-          <w:i w:val="0"/>
-          <w:sz w:val="24"/>
-        </w:rPr>
-        <w:t>Máximo de iterações:</w:t>
-      </w:r>
-      <w:r>
-        <w:rPr>
-          <w:rFonts w:ascii="Arial" w:hAnsi="Arial"/>
-          <w:b w:val="0"/>
-          <w:i w:val="0"/>
-          <w:sz w:val="24"/>
-        </w:rPr>
-        <w:t xml:space="preserve"> número máximo de subdivisões permitidas antes da interrupção forçada.</w:t>
-      </w:r>
-    </w:p>
-    <w:p/>
-    <w:p>
-      <w:pPr>
-        <w:spacing w:before="60" w:after="120" w:line="360" w:lineRule="auto"/>
-        <w:ind w:firstLine="0"/>
-        <w:jc w:val="center"/>
-      </w:pPr>
-      <w:r>
-        <w:rPr>
-          <w:rFonts w:ascii="Arial" w:hAnsi="Arial"/>
-          <w:b w:val="0"/>
-          <w:sz w:val="20"/>
-        </w:rPr>
-        <w:t>Figura 3 — Formulário do método de Bisseção</w:t>
-      </w:r>
-    </w:p>
-    <w:p>
-      <w:pPr>
-        <w:spacing w:before="60" w:after="120" w:line="360" w:lineRule="auto"/>
-        <w:ind w:firstLine="0"/>
-        <w:jc w:val="center"/>
-      </w:pPr>
-      <w:r>
-        <w:rPr>
-          <w:rFonts w:ascii="Arial" w:hAnsi="Arial"/>
-          <w:b w:val="0"/>
-          <w:sz w:val="20"/>
-        </w:rPr>
-        <w:t>Fonte: Os autores (2025)</w:t>
-      </w:r>
-    </w:p>
-    <w:p/>
-    <w:p>
-      <w:pPr>
-        <w:spacing w:before="60" w:after="120" w:line="360" w:lineRule="auto"/>
-        <w:ind w:firstLine="0"/>
-        <w:jc w:val="center"/>
-      </w:pPr>
-      <w:r>
-        <w:rPr>
-          <w:rFonts w:ascii="Arial" w:hAnsi="Arial"/>
-          <w:b w:val="0"/>
-          <w:sz w:val="20"/>
-        </w:rPr>
-        <w:t>Figura 4 — Resultado do cálculo pelo método de Bisseção</w:t>
-      </w:r>
-    </w:p>
-    <w:p>
-      <w:pPr>
-        <w:spacing w:before="60" w:after="120" w:line="360" w:lineRule="auto"/>
-        <w:ind w:firstLine="0"/>
-        <w:jc w:val="center"/>
-      </w:pPr>
-      <w:r>
-        <w:rPr>
-          <w:rFonts w:ascii="Arial" w:hAnsi="Arial"/>
-          <w:b w:val="0"/>
-          <w:sz w:val="20"/>
-        </w:rPr>
-        <w:t>Fonte: Os autores (2025)</w:t>
-      </w:r>
-    </w:p>
-    <w:p/>
-    <w:p>
-      <w:pPr>
-        <w:spacing w:before="60" w:after="120" w:line="360" w:lineRule="auto"/>
-        <w:ind w:firstLine="0"/>
-        <w:jc w:val="center"/>
-      </w:pPr>
-      <w:r>
-        <w:rPr>
-          <w:rFonts w:ascii="Arial" w:hAnsi="Arial"/>
-          <w:b w:val="0"/>
-          <w:sz w:val="20"/>
-        </w:rPr>
-        <w:t>Figura 5 — Clark Calc apresentando a explicação do resultado da Bisseção</w:t>
-      </w:r>
-    </w:p>
-    <w:p>
-      <w:pPr>
-        <w:spacing w:before="60" w:after="120" w:line="360" w:lineRule="auto"/>
-        <w:ind w:firstLine="0"/>
-        <w:jc w:val="center"/>
-      </w:pPr>
-      <w:r>
-        <w:rPr>
-          <w:rFonts w:ascii="Arial" w:hAnsi="Arial"/>
-          <w:b w:val="0"/>
-          <w:sz w:val="20"/>
-        </w:rPr>
-        <w:t>Fonte: Os autores (2025)</w:t>
-      </w:r>
-    </w:p>
-    <w:p/>
-    <w:p>
-      <w:pPr>
-        <w:spacing w:before="120" w:after="60" w:line="360" w:lineRule="auto"/>
-        <w:ind w:firstLine="0"/>
-        <w:jc w:val="left"/>
-      </w:pPr>
-      <w:r>
-        <w:rPr>
-          <w:rFonts w:ascii="Arial" w:hAnsi="Arial"/>
-          <w:b/>
-          <w:sz w:val="24"/>
-        </w:rPr>
-        <w:t>3.2 Ponto Fixo</w:t>
-      </w:r>
-    </w:p>
-    <w:p>
-      <w:pPr>
-        <w:spacing w:before="0" w:after="0" w:line="360" w:lineRule="auto"/>
-        <w:ind w:firstLine="709"/>
-        <w:jc w:val="both"/>
-      </w:pPr>
-      <w:r>
-        <w:rPr>
-          <w:rFonts w:ascii="Arial" w:hAnsi="Arial"/>
-          <w:b w:val="0"/>
-          <w:i w:val="0"/>
-          <w:sz w:val="24"/>
-        </w:rPr>
-        <w:t>O método do Ponto Fixo reformula o problema f(x) = 0 como x = g(x) e itera até a convergência. Para que o método convirja, é necessário que |g'(x)| &lt; 1 na região da raiz. O usuário deve fornecer uma função de iteração g(x) matematicamente adequada, pois a escolha inadequada de g(x) pode levar à divergência.</w:t>
-      </w:r>
-    </w:p>
-    <w:p>
-      <w:pPr>
-        <w:spacing w:before="0" w:after="0" w:line="360" w:lineRule="auto"/>
-        <w:ind w:firstLine="709"/>
-        <w:jc w:val="both"/>
-      </w:pPr>
-      <w:r>
-        <w:rPr>
-          <w:rFonts w:ascii="Arial" w:hAnsi="Arial"/>
-          <w:b w:val="0"/>
-          <w:i w:val="0"/>
-          <w:sz w:val="24"/>
-        </w:rPr>
-        <w:t>Os parâmetros necessários são:</w:t>
-      </w:r>
-    </w:p>
-    <w:p>
-      <w:pPr>
-        <w:spacing w:before="0" w:after="0" w:line="360" w:lineRule="auto"/>
-        <w:ind w:left="709"/>
-        <w:jc w:val="both"/>
-      </w:pPr>
-      <w:r>
-        <w:rPr>
-          <w:rFonts w:ascii="Arial" w:hAnsi="Arial"/>
-          <w:b/>
-          <w:i w:val="0"/>
-          <w:sz w:val="24"/>
-        </w:rPr>
-        <w:t xml:space="preserve">a) </w:t>
-      </w:r>
-      <w:r>
-        <w:rPr>
-          <w:rFonts w:ascii="Arial" w:hAnsi="Arial"/>
-          <w:b/>
-          <w:i w:val="0"/>
-          <w:sz w:val="24"/>
-        </w:rPr>
-        <w:t>Função g(x):</w:t>
-      </w:r>
-      <w:r>
-        <w:rPr>
-          <w:rFonts w:ascii="Arial" w:hAnsi="Arial"/>
-          <w:b w:val="0"/>
-          <w:i w:val="0"/>
-          <w:sz w:val="24"/>
-        </w:rPr>
-        <w:t xml:space="preserve"> função de iteração tal que x = g(x); deve satisfazer |g'(x)| &lt; 1 na região da raiz;</w:t>
-      </w:r>
-    </w:p>
-    <w:p>
-      <w:pPr>
-        <w:spacing w:before="0" w:after="0" w:line="360" w:lineRule="auto"/>
-        <w:ind w:left="709"/>
-        <w:jc w:val="both"/>
-      </w:pPr>
-      <w:r>
-        <w:rPr>
-          <w:rFonts w:ascii="Arial" w:hAnsi="Arial"/>
-          <w:b/>
-          <w:i w:val="0"/>
-          <w:sz w:val="24"/>
-        </w:rPr>
-        <w:t xml:space="preserve">b) </w:t>
-      </w:r>
-      <w:r>
-        <w:rPr>
-          <w:rFonts w:ascii="Arial" w:hAnsi="Arial"/>
-          <w:b/>
-          <w:i w:val="0"/>
-          <w:sz w:val="24"/>
-        </w:rPr>
-        <w:t>Valor inicial (x₀):</w:t>
-      </w:r>
-      <w:r>
-        <w:rPr>
-          <w:rFonts w:ascii="Arial" w:hAnsi="Arial"/>
-          <w:b w:val="0"/>
-          <w:i w:val="0"/>
-          <w:sz w:val="24"/>
-        </w:rPr>
-        <w:t xml:space="preserve"> ponto de partida da sequência iterativa.</w:t>
-      </w:r>
-    </w:p>
-    <w:p/>
-    <w:p>
-      <w:pPr>
-        <w:spacing w:before="60" w:after="120" w:line="360" w:lineRule="auto"/>
-        <w:ind w:firstLine="0"/>
-        <w:jc w:val="center"/>
-      </w:pPr>
-      <w:r>
-        <w:rPr>
-          <w:rFonts w:ascii="Arial" w:hAnsi="Arial"/>
-          <w:b w:val="0"/>
-          <w:sz w:val="20"/>
-        </w:rPr>
-        <w:t>Figura 6 — Formulário do método de Ponto Fixo</w:t>
-      </w:r>
-    </w:p>
-    <w:p>
-      <w:pPr>
-        <w:spacing w:before="60" w:after="120" w:line="360" w:lineRule="auto"/>
-        <w:ind w:firstLine="0"/>
-        <w:jc w:val="center"/>
-      </w:pPr>
-      <w:r>
-        <w:rPr>
-          <w:rFonts w:ascii="Arial" w:hAnsi="Arial"/>
-          <w:b w:val="0"/>
-          <w:sz w:val="20"/>
-        </w:rPr>
-        <w:t>Fonte: Os autores (2025)</w:t>
-      </w:r>
-    </w:p>
-    <w:p/>
-    <w:p>
-      <w:pPr>
-        <w:spacing w:before="60" w:after="120" w:line="360" w:lineRule="auto"/>
-        <w:ind w:firstLine="0"/>
-        <w:jc w:val="center"/>
-      </w:pPr>
-      <w:r>
-        <w:rPr>
-          <w:rFonts w:ascii="Arial" w:hAnsi="Arial"/>
-          <w:b w:val="0"/>
-          <w:sz w:val="20"/>
-        </w:rPr>
-        <w:t>Figura 7 — Resultado do cálculo pelo método de Ponto Fixo</w:t>
-      </w:r>
-    </w:p>
-    <w:p>
-      <w:pPr>
-        <w:spacing w:before="60" w:after="120" w:line="360" w:lineRule="auto"/>
-        <w:ind w:firstLine="0"/>
-        <w:jc w:val="center"/>
-      </w:pPr>
-      <w:r>
-        <w:rPr>
-          <w:rFonts w:ascii="Arial" w:hAnsi="Arial"/>
-          <w:b w:val="0"/>
-          <w:sz w:val="20"/>
-        </w:rPr>
-        <w:t>Fonte: Os autores (2025)</w:t>
-      </w:r>
-    </w:p>
-    <w:p/>
-    <w:p>
-      <w:pPr>
-        <w:spacing w:before="60" w:after="120" w:line="360" w:lineRule="auto"/>
-        <w:ind w:firstLine="0"/>
-        <w:jc w:val="center"/>
-      </w:pPr>
-      <w:r>
-        <w:rPr>
-          <w:rFonts w:ascii="Arial" w:hAnsi="Arial"/>
-          <w:b w:val="0"/>
-          <w:sz w:val="20"/>
-        </w:rPr>
-        <w:t>Figura 8 — Clark Calc apresentando a explicação do resultado do Ponto Fixo</w:t>
-      </w:r>
-    </w:p>
-    <w:p>
-      <w:pPr>
-        <w:spacing w:before="60" w:after="120" w:line="360" w:lineRule="auto"/>
-        <w:ind w:firstLine="0"/>
-        <w:jc w:val="center"/>
-      </w:pPr>
-      <w:r>
-        <w:rPr>
-          <w:rFonts w:ascii="Arial" w:hAnsi="Arial"/>
-          <w:b w:val="0"/>
-          <w:sz w:val="20"/>
-        </w:rPr>
-        <w:t>Fonte: Os autores (2025)</w:t>
-      </w:r>
-    </w:p>
-    <w:p/>
-    <w:p>
-      <w:pPr>
-        <w:spacing w:before="120" w:after="60" w:line="360" w:lineRule="auto"/>
-        <w:ind w:firstLine="0"/>
-        <w:jc w:val="left"/>
-      </w:pPr>
-      <w:r>
-        <w:rPr>
-          <w:rFonts w:ascii="Arial" w:hAnsi="Arial"/>
-          <w:b/>
-          <w:sz w:val="24"/>
-        </w:rPr>
-        <w:t>3.3 Newton-Raphson</w:t>
-      </w:r>
-    </w:p>
-    <w:p>
-      <w:pPr>
-        <w:spacing w:before="0" w:after="0" w:line="360" w:lineRule="auto"/>
-        <w:ind w:firstLine="709"/>
-        <w:jc w:val="both"/>
-      </w:pPr>
-      <w:r>
-        <w:rPr>
-          <w:rFonts w:ascii="Arial" w:hAnsi="Arial"/>
-          <w:b w:val="0"/>
-          <w:i w:val="0"/>
-          <w:sz w:val="24"/>
-        </w:rPr>
-        <w:t>O método de Newton-Raphson utiliza a derivada da função para convergir quadraticamente à raiz, tornando-o o mais rápido dentre os quatro métodos disponíveis. A derivada é calculada automaticamente pelo sistema por meio da biblioteca SymPy. Como requisito, f'(x) não deve ser nula na região da raiz; caso contrário, o algoritmo falha por divisão por zero.</w:t>
-      </w:r>
-    </w:p>
-    <w:p>
-      <w:pPr>
-        <w:spacing w:before="0" w:after="0" w:line="360" w:lineRule="auto"/>
-        <w:ind w:firstLine="709"/>
-        <w:jc w:val="both"/>
-      </w:pPr>
-      <w:r>
-        <w:rPr>
-          <w:rFonts w:ascii="Arial" w:hAnsi="Arial"/>
-          <w:b w:val="0"/>
-          <w:i w:val="0"/>
-          <w:sz w:val="24"/>
-        </w:rPr>
-        <w:t>O parâmetro necessário é:</w:t>
-      </w:r>
-    </w:p>
-    <w:p>
-      <w:pPr>
-        <w:spacing w:before="0" w:after="0" w:line="360" w:lineRule="auto"/>
-        <w:ind w:left="709"/>
-        <w:jc w:val="both"/>
-      </w:pPr>
-      <w:r>
-        <w:rPr>
-          <w:rFonts w:ascii="Arial" w:hAnsi="Arial"/>
-          <w:b/>
-          <w:i w:val="0"/>
-          <w:sz w:val="24"/>
-        </w:rPr>
-        <w:t xml:space="preserve">a) </w:t>
-      </w:r>
-      <w:r>
-        <w:rPr>
-          <w:rFonts w:ascii="Arial" w:hAnsi="Arial"/>
-          <w:b/>
-          <w:i w:val="0"/>
-          <w:sz w:val="24"/>
-        </w:rPr>
-        <w:t>Valor inicial (x₀):</w:t>
-      </w:r>
-      <w:r>
-        <w:rPr>
-          <w:rFonts w:ascii="Arial" w:hAnsi="Arial"/>
-          <w:b w:val="0"/>
-          <w:i w:val="0"/>
-          <w:sz w:val="24"/>
-        </w:rPr>
-        <w:t xml:space="preserve"> ponto de partida; quanto mais próximo da raiz real, maior a probabilidade de convergência.</w:t>
-      </w:r>
-    </w:p>
-    <w:p/>
-    <w:p>
-      <w:pPr>
-        <w:spacing w:before="60" w:after="120" w:line="360" w:lineRule="auto"/>
-        <w:ind w:firstLine="0"/>
-        <w:jc w:val="center"/>
-      </w:pPr>
-      <w:r>
-        <w:rPr>
-          <w:rFonts w:ascii="Arial" w:hAnsi="Arial"/>
-          <w:b w:val="0"/>
-          <w:sz w:val="20"/>
-        </w:rPr>
-        <w:t>Figura 9 — Formulário do método de Newton-Raphson</w:t>
-      </w:r>
-    </w:p>
-    <w:p>
-      <w:pPr>
-        <w:spacing w:before="60" w:after="120" w:line="360" w:lineRule="auto"/>
-        <w:ind w:firstLine="0"/>
-        <w:jc w:val="center"/>
-      </w:pPr>
-      <w:r>
-        <w:rPr>
-          <w:rFonts w:ascii="Arial" w:hAnsi="Arial"/>
-          <w:b w:val="0"/>
-          <w:sz w:val="20"/>
-        </w:rPr>
-        <w:t>Fonte: Os autores (2025)</w:t>
-      </w:r>
-    </w:p>
-    <w:p/>
-    <w:p>
-      <w:pPr>
-        <w:spacing w:before="60" w:after="120" w:line="360" w:lineRule="auto"/>
-        <w:ind w:firstLine="0"/>
-        <w:jc w:val="center"/>
-      </w:pPr>
-      <w:r>
-        <w:rPr>
-          <w:rFonts w:ascii="Arial" w:hAnsi="Arial"/>
-          <w:b w:val="0"/>
-          <w:sz w:val="20"/>
-        </w:rPr>
-        <w:t>Figura 10 — Resultado do cálculo pelo método de Newton-Raphson</w:t>
-      </w:r>
-    </w:p>
-    <w:p>
-      <w:pPr>
-        <w:spacing w:before="60" w:after="120" w:line="360" w:lineRule="auto"/>
-        <w:ind w:firstLine="0"/>
-        <w:jc w:val="center"/>
-      </w:pPr>
-      <w:r>
-        <w:rPr>
-          <w:rFonts w:ascii="Arial" w:hAnsi="Arial"/>
-          <w:b w:val="0"/>
-          <w:sz w:val="20"/>
-        </w:rPr>
-        <w:t>Fonte: Os autores (2025)</w:t>
-      </w:r>
-    </w:p>
-    <w:p/>
-    <w:p>
-      <w:pPr>
-        <w:spacing w:before="60" w:after="120" w:line="360" w:lineRule="auto"/>
-        <w:ind w:firstLine="0"/>
-        <w:jc w:val="center"/>
-      </w:pPr>
-      <w:r>
-        <w:rPr>
-          <w:rFonts w:ascii="Arial" w:hAnsi="Arial"/>
-          <w:b w:val="0"/>
-          <w:sz w:val="20"/>
-        </w:rPr>
-        <w:t>Figura 11 — Clark Calc apresentando a explicação do resultado de Newton-Raphson</w:t>
-      </w:r>
-    </w:p>
-    <w:p>
-      <w:pPr>
-        <w:spacing w:before="60" w:after="120" w:line="360" w:lineRule="auto"/>
-        <w:ind w:firstLine="0"/>
-        <w:jc w:val="center"/>
-      </w:pPr>
-      <w:r>
-        <w:rPr>
-          <w:rFonts w:ascii="Arial" w:hAnsi="Arial"/>
-          <w:b w:val="0"/>
-          <w:sz w:val="20"/>
-        </w:rPr>
-        <w:t>Fonte: Os autores (2025)</w:t>
-      </w:r>
-    </w:p>
-    <w:p/>
-    <w:p>
-      <w:pPr>
-        <w:spacing w:before="120" w:after="60" w:line="360" w:lineRule="auto"/>
-        <w:ind w:firstLine="0"/>
-        <w:jc w:val="left"/>
-      </w:pPr>
-      <w:r>
-        <w:rPr>
-          <w:rFonts w:ascii="Arial" w:hAnsi="Arial"/>
-          <w:b/>
-          <w:sz w:val="24"/>
-        </w:rPr>
-        <w:t>3.4 Secantes</w:t>
-      </w:r>
-    </w:p>
-    <w:p>
-      <w:pPr>
-        <w:spacing w:before="0" w:after="0" w:line="360" w:lineRule="auto"/>
-        <w:ind w:firstLine="709"/>
-        <w:jc w:val="both"/>
-      </w:pPr>
-      <w:r>
-        <w:rPr>
-          <w:rFonts w:ascii="Arial" w:hAnsi="Arial"/>
-          <w:b w:val="0"/>
-          <w:i w:val="0"/>
-          <w:sz w:val="24"/>
-        </w:rPr>
-        <w:t>O método das Secantes aproxima a derivada de f(x) por meio de uma diferença finita entre dois pontos consecutivos, dispensando o cálculo analítico da derivada. Apresenta convergência superlinear (ordem aproximada de 1,618), sendo uma alternativa eficiente quando a derivada é difícil de obter.</w:t>
-      </w:r>
-    </w:p>
-    <w:p>
-      <w:pPr>
-        <w:spacing w:before="0" w:after="0" w:line="360" w:lineRule="auto"/>
-        <w:ind w:firstLine="709"/>
-        <w:jc w:val="both"/>
-      </w:pPr>
-      <w:r>
-        <w:rPr>
-          <w:rFonts w:ascii="Arial" w:hAnsi="Arial"/>
-          <w:b w:val="0"/>
-          <w:i w:val="0"/>
-          <w:sz w:val="24"/>
-        </w:rPr>
-        <w:t>O parâmetro necessário é:</w:t>
-      </w:r>
-    </w:p>
-    <w:p>
-      <w:pPr>
-        <w:spacing w:before="0" w:after="0" w:line="360" w:lineRule="auto"/>
-        <w:ind w:left="709"/>
-        <w:jc w:val="both"/>
-      </w:pPr>
-      <w:r>
-        <w:rPr>
-          <w:rFonts w:ascii="Arial" w:hAnsi="Arial"/>
-          <w:b/>
-          <w:i w:val="0"/>
-          <w:sz w:val="24"/>
-        </w:rPr>
-        <w:t xml:space="preserve">a) </w:t>
-      </w:r>
-      <w:r>
-        <w:rPr>
-          <w:rFonts w:ascii="Arial" w:hAnsi="Arial"/>
-          <w:b/>
-          <w:i w:val="0"/>
-          <w:sz w:val="24"/>
-        </w:rPr>
-        <w:t>Valores iniciais (x₀) e (x₁):</w:t>
-      </w:r>
-      <w:r>
-        <w:rPr>
-          <w:rFonts w:ascii="Arial" w:hAnsi="Arial"/>
-          <w:b w:val="0"/>
-          <w:i w:val="0"/>
-          <w:sz w:val="24"/>
-        </w:rPr>
-        <w:t xml:space="preserve"> dois pontos de partida distintos, preferencialmente próximos da raiz.</w:t>
-      </w:r>
-    </w:p>
-    <w:p/>
-    <w:p>
-      <w:pPr>
-        <w:spacing w:before="60" w:after="120" w:line="360" w:lineRule="auto"/>
-        <w:ind w:firstLine="0"/>
-        <w:jc w:val="center"/>
-      </w:pPr>
-      <w:r>
-        <w:rPr>
-          <w:rFonts w:ascii="Arial" w:hAnsi="Arial"/>
-          <w:b w:val="0"/>
-          <w:sz w:val="20"/>
-        </w:rPr>
-        <w:t>Figura 12 — Formulário do método das Secantes</w:t>
-      </w:r>
-    </w:p>
-    <w:p>
-      <w:pPr>
-        <w:spacing w:before="60" w:after="120" w:line="360" w:lineRule="auto"/>
-        <w:ind w:firstLine="0"/>
-        <w:jc w:val="center"/>
-      </w:pPr>
-      <w:r>
-        <w:rPr>
-          <w:rFonts w:ascii="Arial" w:hAnsi="Arial"/>
-          <w:b w:val="0"/>
-          <w:sz w:val="20"/>
-        </w:rPr>
-        <w:t>Fonte: Os autores (2025)</w:t>
-      </w:r>
-    </w:p>
-    <w:p/>
-    <w:p>
-      <w:pPr>
-        <w:spacing w:before="60" w:after="120" w:line="360" w:lineRule="auto"/>
-        <w:ind w:firstLine="0"/>
-        <w:jc w:val="center"/>
-      </w:pPr>
-      <w:r>
-        <w:rPr>
-          <w:rFonts w:ascii="Arial" w:hAnsi="Arial"/>
-          <w:b w:val="0"/>
-          <w:sz w:val="20"/>
-        </w:rPr>
-        <w:t>Figura 13 — Resultado do cálculo pelo método das Secantes</w:t>
-      </w:r>
-    </w:p>
-    <w:p>
-      <w:pPr>
-        <w:spacing w:before="60" w:after="120" w:line="360" w:lineRule="auto"/>
-        <w:ind w:firstLine="0"/>
-        <w:jc w:val="center"/>
-      </w:pPr>
-      <w:r>
-        <w:rPr>
-          <w:rFonts w:ascii="Arial" w:hAnsi="Arial"/>
-          <w:b w:val="0"/>
-          <w:sz w:val="20"/>
-        </w:rPr>
-        <w:t>Fonte: Os autores (2025)</w:t>
-      </w:r>
-    </w:p>
-    <w:p/>
-    <w:p>
-      <w:pPr>
-        <w:spacing w:before="60" w:after="120" w:line="360" w:lineRule="auto"/>
-        <w:ind w:firstLine="0"/>
-        <w:jc w:val="center"/>
-      </w:pPr>
-      <w:r>
-        <w:rPr>
-          <w:rFonts w:ascii="Arial" w:hAnsi="Arial"/>
-          <w:b w:val="0"/>
-          <w:sz w:val="20"/>
-        </w:rPr>
-        <w:t>Figura 14 — Clark Calc apresentando a explicação do resultado das Secantes</w:t>
-      </w:r>
-    </w:p>
-    <w:p>
-      <w:pPr>
-        <w:spacing w:before="60" w:after="120" w:line="360" w:lineRule="auto"/>
-        <w:ind w:firstLine="0"/>
-        <w:jc w:val="center"/>
-      </w:pPr>
-      <w:r>
-        <w:rPr>
-          <w:rFonts w:ascii="Arial" w:hAnsi="Arial"/>
-          <w:b w:val="0"/>
           <w:sz w:val="20"/>
         </w:rPr>
         <w:t>Fonte: Os autores (2025)</w:t>
@@ -2029,7 +1006,7 @@
     </w:p>
     <w:p>
       <w:pPr>
-        <w:spacing w:before="240" w:after="120" w:line="360" w:lineRule="auto"/>
+        <w:spacing w:before="360" w:after="120" w:line="360" w:lineRule="auto"/>
         <w:ind w:firstLine="0"/>
         <w:jc w:val="left"/>
       </w:pPr>
@@ -2037,9 +1014,10 @@
         <w:rPr>
           <w:rFonts w:ascii="Arial" w:hAnsi="Arial"/>
           <w:b/>
+          <w:i w:val="0"/>
           <w:sz w:val="24"/>
         </w:rPr>
-        <w:t>4 MÓDULO: SISTEMAS LINEARES</w:t>
+        <w:t>4 MÓDULO: RAÍZES DE FUNÇÕES</w:t>
       </w:r>
     </w:p>
     <w:p>
@@ -2055,15 +1033,49 @@
           <w:i w:val="0"/>
           <w:sz w:val="24"/>
         </w:rPr>
-        <w:t>Este módulo resolve sistemas de equações lineares da forma Ax = b, onde A é a matriz de coeficientes, x é o vetor de incógnitas e b é o vetor de termos independentes. Estão disponíveis quatro métodos, divididos entre diretos (Eliminação de Gauss e Fatoração LU) e iterativos (Jacobi e Gauss-Seidel).</w:t>
+        <w:t>Este módulo encontra o valor de x para o qual uma função f(x) se iguala a zero.</w:t>
       </w:r>
     </w:p>
     <w:p>
       <w:pPr>
+        <w:spacing w:before="240" w:after="60" w:line="360" w:lineRule="auto"/>
+        <w:ind w:firstLine="0"/>
+        <w:jc w:val="left"/>
+      </w:pPr>
+      <w:r>
+        <w:rPr>
+          <w:rFonts w:ascii="Arial" w:hAnsi="Arial"/>
+          <w:b/>
+          <w:i w:val="0"/>
+          <w:sz w:val="24"/>
+        </w:rPr>
+        <w:t>4.1 Como usar</w:t>
+      </w:r>
+    </w:p>
+    <w:p>
+      <w:pPr>
         <w:spacing w:before="0" w:after="0" w:line="360" w:lineRule="auto"/>
-        <w:ind w:firstLine="709"/>
+        <w:ind w:firstLine="0" w:left="709"/>
         <w:jc w:val="both"/>
       </w:pPr>
+      <w:r>
+        <w:rPr>
+          <w:rFonts w:ascii="Arial" w:hAnsi="Arial"/>
+          <w:b/>
+          <w:i w:val="0"/>
+          <w:sz w:val="24"/>
+        </w:rPr>
+        <w:t xml:space="preserve">1. </w:t>
+      </w:r>
+      <w:r>
+        <w:rPr>
+          <w:rFonts w:ascii="Arial" w:hAnsi="Arial"/>
+          <w:b/>
+          <w:i w:val="0"/>
+          <w:sz w:val="24"/>
+        </w:rPr>
+        <w:t>Selecione o método</w:t>
+      </w:r>
       <w:r>
         <w:rPr>
           <w:rFonts w:ascii="Arial" w:hAnsi="Arial"/>
@@ -2071,31 +1083,33 @@
           <w:i w:val="0"/>
           <w:sz w:val="24"/>
         </w:rPr>
-        <w:t>Para todos os métodos deste módulo, o procedimento geral consiste em: informar a dimensão n do sistema, preencher a matriz A (n × n) e o vetor b (n × 1), e clicar em "RESOLVER".</w:t>
+        <w:t xml:space="preserve"> no menu suspenso "Escolha o método";</w:t>
       </w:r>
     </w:p>
-    <w:p/>
     <w:p>
       <w:pPr>
-        <w:spacing w:before="120" w:after="60" w:line="360" w:lineRule="auto"/>
-        <w:ind w:firstLine="0"/>
-        <w:jc w:val="left"/>
+        <w:spacing w:before="0" w:after="0" w:line="360" w:lineRule="auto"/>
+        <w:ind w:firstLine="0" w:left="709"/>
+        <w:jc w:val="both"/>
       </w:pPr>
       <w:r>
         <w:rPr>
           <w:rFonts w:ascii="Arial" w:hAnsi="Arial"/>
           <w:b/>
+          <w:i w:val="0"/>
           <w:sz w:val="24"/>
         </w:rPr>
-        <w:t>4.1 Eliminação de Gauss com Pivoteamento</w:t>
+        <w:t xml:space="preserve">2. </w:t>
       </w:r>
-    </w:p>
-    <w:p>
-      <w:pPr>
-        <w:spacing w:before="0" w:after="0" w:line="360" w:lineRule="auto"/>
-        <w:ind w:firstLine="709"/>
-        <w:jc w:val="both"/>
-      </w:pPr>
+      <w:r>
+        <w:rPr>
+          <w:rFonts w:ascii="Arial" w:hAnsi="Arial"/>
+          <w:b/>
+          <w:i w:val="0"/>
+          <w:sz w:val="24"/>
+        </w:rPr>
+        <w:t>Digite a função</w:t>
+      </w:r>
       <w:r>
         <w:rPr>
           <w:rFonts w:ascii="Arial" w:hAnsi="Arial"/>
@@ -2103,13 +1117,81 @@
           <w:i w:val="0"/>
           <w:sz w:val="24"/>
         </w:rPr>
-        <w:t>Método direto que transforma o sistema em uma forma triangular superior por meio de operações elementares de linha, utilizando pivoteamento parcial para evitar instabilidades numéricas causadas pela divisão por valores próximos de zero. A solução é obtida por substituição retroativa.</w:t>
+        <w:t xml:space="preserve"> no campo "Função f(x)" usando notação Python (ex.: x**3 - x - 2);</w:t>
+      </w:r>
+    </w:p>
+    <w:p>
+      <w:pPr>
+        <w:spacing w:before="0" w:after="0" w:line="360" w:lineRule="auto"/>
+        <w:ind w:firstLine="0" w:left="709"/>
+        <w:jc w:val="both"/>
+      </w:pPr>
+      <w:r>
+        <w:rPr>
+          <w:rFonts w:ascii="Arial" w:hAnsi="Arial"/>
+          <w:b/>
+          <w:i w:val="0"/>
+          <w:sz w:val="24"/>
+        </w:rPr>
+        <w:t xml:space="preserve">3. </w:t>
+      </w:r>
+      <w:r>
+        <w:rPr>
+          <w:rFonts w:ascii="Arial" w:hAnsi="Arial"/>
+          <w:b/>
+          <w:i w:val="0"/>
+          <w:sz w:val="24"/>
+        </w:rPr>
+        <w:t>Preencha os parâmetros</w:t>
+      </w:r>
+      <w:r>
+        <w:rPr>
+          <w:rFonts w:ascii="Arial" w:hAnsi="Arial"/>
+          <w:b w:val="0"/>
+          <w:i w:val="0"/>
+          <w:sz w:val="24"/>
+        </w:rPr>
+        <w:t xml:space="preserve"> específicos do método selecionado;</w:t>
+      </w:r>
+    </w:p>
+    <w:p>
+      <w:pPr>
+        <w:spacing w:before="0" w:after="0" w:line="360" w:lineRule="auto"/>
+        <w:ind w:firstLine="0" w:left="709"/>
+        <w:jc w:val="both"/>
+      </w:pPr>
+      <w:r>
+        <w:rPr>
+          <w:rFonts w:ascii="Arial" w:hAnsi="Arial"/>
+          <w:b/>
+          <w:i w:val="0"/>
+          <w:sz w:val="24"/>
+        </w:rPr>
+        <w:t xml:space="preserve">4. </w:t>
+      </w:r>
+      <w:r>
+        <w:rPr>
+          <w:rFonts w:ascii="Arial" w:hAnsi="Arial"/>
+          <w:b/>
+          <w:i w:val="0"/>
+          <w:sz w:val="24"/>
+        </w:rPr>
+        <w:t>Clique em</w:t>
+      </w:r>
+      <w:r>
+        <w:rPr>
+          <w:rFonts w:ascii="Arial" w:hAnsi="Arial"/>
+          <w:b w:val="0"/>
+          <w:i w:val="0"/>
+          <w:sz w:val="24"/>
+        </w:rPr>
+        <w:t xml:space="preserve"> "ENCONTRAR RAIZ".</w:t>
       </w:r>
     </w:p>
     <w:p/>
     <w:p>
       <w:pPr>
-        <w:spacing w:before="60" w:after="120" w:line="360" w:lineRule="auto"/>
+        <w:spacing w:before="60" w:after="60" w:line="240" w:lineRule="auto"/>
         <w:ind w:firstLine="0"/>
         <w:jc w:val="center"/>
       </w:pPr>
@@ -2117,14 +1199,15 @@
         <w:rPr>
           <w:rFonts w:ascii="Arial" w:hAnsi="Arial"/>
           <w:b w:val="0"/>
+          <w:i w:val="0"/>
           <w:sz w:val="20"/>
         </w:rPr>
-        <w:t>Figura 15 — Formulário da Eliminação de Gauss com Pivoteamento</w:t>
+        <w:t>Figura 2 — Formulário do módulo de Raízes de Funções</w:t>
       </w:r>
     </w:p>
     <w:p>
       <w:pPr>
-        <w:spacing w:before="60" w:after="120" w:line="360" w:lineRule="auto"/>
+        <w:spacing w:before="60" w:after="60" w:line="240" w:lineRule="auto"/>
         <w:ind w:firstLine="0"/>
         <w:jc w:val="center"/>
       </w:pPr>
@@ -2132,6 +1215,7 @@
         <w:rPr>
           <w:rFonts w:ascii="Arial" w:hAnsi="Arial"/>
           <w:b w:val="0"/>
+          <w:i w:val="0"/>
           <w:sz w:val="20"/>
         </w:rPr>
         <w:t>Fonte: Os autores (2025)</w:t>
@@ -2140,7 +1224,7 @@
     <w:p/>
     <w:p>
       <w:pPr>
-        <w:spacing w:before="60" w:after="120" w:line="360" w:lineRule="auto"/>
+        <w:spacing w:before="60" w:after="60" w:line="240" w:lineRule="auto"/>
         <w:ind w:firstLine="0"/>
         <w:jc w:val="center"/>
       </w:pPr>
@@ -2148,14 +1232,15 @@
         <w:rPr>
           <w:rFonts w:ascii="Arial" w:hAnsi="Arial"/>
           <w:b w:val="0"/>
+          <w:i w:val="0"/>
           <w:sz w:val="20"/>
         </w:rPr>
-        <w:t>Figura 16 — Resultado da Eliminação de Gauss com Pivoteamento</w:t>
+        <w:t>Figura 3 — Resultado do cálculo e explicação do Clark Calc</w:t>
       </w:r>
     </w:p>
     <w:p>
       <w:pPr>
-        <w:spacing w:before="60" w:after="120" w:line="360" w:lineRule="auto"/>
+        <w:spacing w:before="60" w:after="60" w:line="240" w:lineRule="auto"/>
         <w:ind w:firstLine="0"/>
         <w:jc w:val="center"/>
       </w:pPr>
@@ -2163,77 +1248,15 @@
         <w:rPr>
           <w:rFonts w:ascii="Arial" w:hAnsi="Arial"/>
           <w:b w:val="0"/>
+          <w:i w:val="0"/>
           <w:sz w:val="20"/>
         </w:rPr>
         <w:t>Fonte: Os autores (2025)</w:t>
       </w:r>
     </w:p>
-    <w:p/>
     <w:p>
       <w:pPr>
-        <w:spacing w:before="60" w:after="120" w:line="360" w:lineRule="auto"/>
-        <w:ind w:firstLine="0"/>
-        <w:jc w:val="center"/>
-      </w:pPr>
-      <w:r>
-        <w:rPr>
-          <w:rFonts w:ascii="Arial" w:hAnsi="Arial"/>
-          <w:b w:val="0"/>
-          <w:sz w:val="20"/>
-        </w:rPr>
-        <w:t>Figura 17 — Clark Calc apresentando a explicação do resultado — parte 1</w:t>
-      </w:r>
-    </w:p>
-    <w:p>
-      <w:pPr>
-        <w:spacing w:before="60" w:after="120" w:line="360" w:lineRule="auto"/>
-        <w:ind w:firstLine="0"/>
-        <w:jc w:val="center"/>
-      </w:pPr>
-      <w:r>
-        <w:rPr>
-          <w:rFonts w:ascii="Arial" w:hAnsi="Arial"/>
-          <w:b w:val="0"/>
-          <w:sz w:val="20"/>
-        </w:rPr>
-        <w:t>Fonte: Os autores (2025)</w:t>
-      </w:r>
-    </w:p>
-    <w:p/>
-    <w:p>
-      <w:pPr>
-        <w:spacing w:before="60" w:after="120" w:line="360" w:lineRule="auto"/>
-        <w:ind w:firstLine="0"/>
-        <w:jc w:val="center"/>
-      </w:pPr>
-      <w:r>
-        <w:rPr>
-          <w:rFonts w:ascii="Arial" w:hAnsi="Arial"/>
-          <w:b w:val="0"/>
-          <w:sz w:val="20"/>
-        </w:rPr>
-        <w:t>Figura 18 — Clark Calc apresentando a explicação do resultado — parte 2</w:t>
-      </w:r>
-    </w:p>
-    <w:p>
-      <w:pPr>
-        <w:spacing w:before="60" w:after="120" w:line="360" w:lineRule="auto"/>
-        <w:ind w:firstLine="0"/>
-        <w:jc w:val="center"/>
-      </w:pPr>
-      <w:r>
-        <w:rPr>
-          <w:rFonts w:ascii="Arial" w:hAnsi="Arial"/>
-          <w:b w:val="0"/>
-          <w:sz w:val="20"/>
-        </w:rPr>
-        <w:t>Fonte: Os autores (2025)</w:t>
-      </w:r>
-    </w:p>
-    <w:p/>
-    <w:p>
-      <w:pPr>
-        <w:spacing w:before="120" w:after="60" w:line="360" w:lineRule="auto"/>
+        <w:spacing w:before="240" w:after="60" w:line="360" w:lineRule="auto"/>
         <w:ind w:firstLine="0"/>
         <w:jc w:val="left"/>
       </w:pPr>
@@ -2241,17 +1264,27 @@
         <w:rPr>
           <w:rFonts w:ascii="Arial" w:hAnsi="Arial"/>
           <w:b/>
+          <w:i w:val="0"/>
           <w:sz w:val="24"/>
         </w:rPr>
-        <w:t>4.2 Fatoração LU</w:t>
+        <w:t>4.2 Métodos disponíveis</w:t>
       </w:r>
     </w:p>
     <w:p>
       <w:pPr>
         <w:spacing w:before="0" w:after="0" w:line="360" w:lineRule="auto"/>
-        <w:ind w:firstLine="709"/>
+        <w:ind w:firstLine="0" w:left="709"/>
         <w:jc w:val="both"/>
       </w:pPr>
+      <w:r>
+        <w:rPr>
+          <w:rFonts w:ascii="Arial" w:hAnsi="Arial"/>
+          <w:b/>
+          <w:i w:val="0"/>
+          <w:sz w:val="24"/>
+        </w:rPr>
+        <w:t>Bisseção:</w:t>
+      </w:r>
       <w:r>
         <w:rPr>
           <w:rFonts w:ascii="Arial" w:hAnsi="Arial"/>
@@ -2259,155 +1292,24 @@
           <w:i w:val="0"/>
           <w:sz w:val="24"/>
         </w:rPr>
-        <w:t>A Fatoração LU decompõe a matriz A no produto de duas matrizes triangulares: L (triangular inferior, com diagonal unitária) e U (triangular superior). O sistema original Ax = b é resolvido em duas etapas sequenciais: substituição progressiva, que resolve Ly = b, e substituição retroativa, que resolve Ux = y. Esse método é especialmente vantajoso quando múltiplos vetores b precisam ser resolvidos para a mesma matriz A, pois a decomposição é realizada uma única vez.</w:t>
-      </w:r>
-    </w:p>
-    <w:p/>
-    <w:p>
-      <w:pPr>
-        <w:spacing w:before="60" w:after="120" w:line="360" w:lineRule="auto"/>
-        <w:ind w:firstLine="0"/>
-        <w:jc w:val="center"/>
-      </w:pPr>
-      <w:r>
-        <w:rPr>
-          <w:rFonts w:ascii="Arial" w:hAnsi="Arial"/>
-          <w:b w:val="0"/>
-          <w:sz w:val="20"/>
-        </w:rPr>
-        <w:t>Figura 19 — Formulário da Fatoração LU</w:t>
+        <w:t xml:space="preserve"> requer intervalo [a, b] onde a função muda de sinal, tolerância e número máximo de iterações;</w:t>
       </w:r>
     </w:p>
     <w:p>
       <w:pPr>
-        <w:spacing w:before="60" w:after="120" w:line="360" w:lineRule="auto"/>
-        <w:ind w:firstLine="0"/>
-        <w:jc w:val="center"/>
-      </w:pPr>
-      <w:r>
-        <w:rPr>
-          <w:rFonts w:ascii="Arial" w:hAnsi="Arial"/>
-          <w:b w:val="0"/>
-          <w:sz w:val="20"/>
-        </w:rPr>
-        <w:t>Fonte: Os autores (2025)</w:t>
-      </w:r>
-    </w:p>
-    <w:p/>
-    <w:p>
-      <w:pPr>
-        <w:spacing w:before="60" w:after="120" w:line="360" w:lineRule="auto"/>
-        <w:ind w:firstLine="0"/>
-        <w:jc w:val="center"/>
-      </w:pPr>
-      <w:r>
-        <w:rPr>
-          <w:rFonts w:ascii="Arial" w:hAnsi="Arial"/>
-          <w:b w:val="0"/>
-          <w:sz w:val="20"/>
-        </w:rPr>
-        <w:t>Figura 20 — Resultado da Fatoração LU</w:t>
-      </w:r>
-    </w:p>
-    <w:p>
-      <w:pPr>
-        <w:spacing w:before="60" w:after="120" w:line="360" w:lineRule="auto"/>
-        <w:ind w:firstLine="0"/>
-        <w:jc w:val="center"/>
-      </w:pPr>
-      <w:r>
-        <w:rPr>
-          <w:rFonts w:ascii="Arial" w:hAnsi="Arial"/>
-          <w:b w:val="0"/>
-          <w:sz w:val="20"/>
-        </w:rPr>
-        <w:t>Fonte: Os autores (2025)</w:t>
-      </w:r>
-    </w:p>
-    <w:p/>
-    <w:p>
-      <w:pPr>
-        <w:spacing w:before="60" w:after="120" w:line="360" w:lineRule="auto"/>
-        <w:ind w:firstLine="0"/>
-        <w:jc w:val="center"/>
-      </w:pPr>
-      <w:r>
-        <w:rPr>
-          <w:rFonts w:ascii="Arial" w:hAnsi="Arial"/>
-          <w:b w:val="0"/>
-          <w:sz w:val="20"/>
-        </w:rPr>
-        <w:t>Figura 21 — Clark Calc apresentando a explicação do resultado — parte 1</w:t>
-      </w:r>
-    </w:p>
-    <w:p>
-      <w:pPr>
-        <w:spacing w:before="60" w:after="120" w:line="360" w:lineRule="auto"/>
-        <w:ind w:firstLine="0"/>
-        <w:jc w:val="center"/>
-      </w:pPr>
-      <w:r>
-        <w:rPr>
-          <w:rFonts w:ascii="Arial" w:hAnsi="Arial"/>
-          <w:b w:val="0"/>
-          <w:sz w:val="20"/>
-        </w:rPr>
-        <w:t>Fonte: Os autores (2025)</w:t>
-      </w:r>
-    </w:p>
-    <w:p/>
-    <w:p>
-      <w:pPr>
-        <w:spacing w:before="60" w:after="120" w:line="360" w:lineRule="auto"/>
-        <w:ind w:firstLine="0"/>
-        <w:jc w:val="center"/>
-      </w:pPr>
-      <w:r>
-        <w:rPr>
-          <w:rFonts w:ascii="Arial" w:hAnsi="Arial"/>
-          <w:b w:val="0"/>
-          <w:sz w:val="20"/>
-        </w:rPr>
-        <w:t>Figura 22 — Clark Calc apresentando a explicação do resultado — parte 2</w:t>
-      </w:r>
-    </w:p>
-    <w:p>
-      <w:pPr>
-        <w:spacing w:before="60" w:after="120" w:line="360" w:lineRule="auto"/>
-        <w:ind w:firstLine="0"/>
-        <w:jc w:val="center"/>
-      </w:pPr>
-      <w:r>
-        <w:rPr>
-          <w:rFonts w:ascii="Arial" w:hAnsi="Arial"/>
-          <w:b w:val="0"/>
-          <w:sz w:val="20"/>
-        </w:rPr>
-        <w:t>Fonte: Os autores (2025)</w:t>
-      </w:r>
-    </w:p>
-    <w:p/>
-    <w:p>
-      <w:pPr>
-        <w:spacing w:before="120" w:after="60" w:line="360" w:lineRule="auto"/>
-        <w:ind w:firstLine="0"/>
-        <w:jc w:val="left"/>
+        <w:spacing w:before="0" w:after="0" w:line="360" w:lineRule="auto"/>
+        <w:ind w:firstLine="0" w:left="709"/>
+        <w:jc w:val="both"/>
       </w:pPr>
       <w:r>
         <w:rPr>
           <w:rFonts w:ascii="Arial" w:hAnsi="Arial"/>
           <w:b/>
+          <w:i w:val="0"/>
           <w:sz w:val="24"/>
         </w:rPr>
-        <w:t>4.3 Jacobi</w:t>
+        <w:t>Ponto Fixo:</w:t>
       </w:r>
-    </w:p>
-    <w:p>
-      <w:pPr>
-        <w:spacing w:before="0" w:after="0" w:line="360" w:lineRule="auto"/>
-        <w:ind w:firstLine="709"/>
-        <w:jc w:val="both"/>
-      </w:pPr>
       <w:r>
         <w:rPr>
           <w:rFonts w:ascii="Arial" w:hAnsi="Arial"/>
@@ -2415,124 +1317,24 @@
           <w:i w:val="0"/>
           <w:sz w:val="24"/>
         </w:rPr>
-        <w:t>O método de Jacobi é um método iterativo que atualiza todas as variáveis simultaneamente em cada iteração, utilizando exclusivamente os valores da iteração anterior. Para garantir a convergência, recomenda-se que a matriz A seja estritamente diagonalmente dominante, condição suficiente (mas não necessária) para que o método convirja.</w:t>
-      </w:r>
-    </w:p>
-    <w:p/>
-    <w:p>
-      <w:pPr>
-        <w:spacing w:before="60" w:after="120" w:line="360" w:lineRule="auto"/>
-        <w:ind w:firstLine="0"/>
-        <w:jc w:val="center"/>
-      </w:pPr>
-      <w:r>
-        <w:rPr>
-          <w:rFonts w:ascii="Arial" w:hAnsi="Arial"/>
-          <w:b w:val="0"/>
-          <w:sz w:val="20"/>
-        </w:rPr>
-        <w:t>Figura 23 — Formulário do método de Jacobi</w:t>
+        <w:t xml:space="preserve"> requer uma função de iteração g(x) e um valor inicial x₀;</w:t>
       </w:r>
     </w:p>
     <w:p>
       <w:pPr>
-        <w:spacing w:before="60" w:after="120" w:line="360" w:lineRule="auto"/>
-        <w:ind w:firstLine="0"/>
-        <w:jc w:val="center"/>
-      </w:pPr>
-      <w:r>
-        <w:rPr>
-          <w:rFonts w:ascii="Arial" w:hAnsi="Arial"/>
-          <w:b w:val="0"/>
-          <w:sz w:val="20"/>
-        </w:rPr>
-        <w:t>Fonte: Os autores (2025)</w:t>
-      </w:r>
-    </w:p>
-    <w:p/>
-    <w:p>
-      <w:pPr>
-        <w:spacing w:before="60" w:after="120" w:line="360" w:lineRule="auto"/>
-        <w:ind w:firstLine="0"/>
-        <w:jc w:val="center"/>
-      </w:pPr>
-      <w:r>
-        <w:rPr>
-          <w:rFonts w:ascii="Arial" w:hAnsi="Arial"/>
-          <w:b w:val="0"/>
-          <w:sz w:val="20"/>
-        </w:rPr>
-        <w:t>Figura 24 — Resultado do método de Jacobi com explicação do Clark Calc — parte 1</w:t>
-      </w:r>
-    </w:p>
-    <w:p>
-      <w:pPr>
-        <w:spacing w:before="60" w:after="120" w:line="360" w:lineRule="auto"/>
-        <w:ind w:firstLine="0"/>
-        <w:jc w:val="center"/>
-      </w:pPr>
-      <w:r>
-        <w:rPr>
-          <w:rFonts w:ascii="Arial" w:hAnsi="Arial"/>
-          <w:b w:val="0"/>
-          <w:sz w:val="20"/>
-        </w:rPr>
-        <w:t>Fonte: Os autores (2025)</w:t>
-      </w:r>
-    </w:p>
-    <w:p/>
-    <w:p>
-      <w:pPr>
-        <w:spacing w:before="60" w:after="120" w:line="360" w:lineRule="auto"/>
-        <w:ind w:firstLine="0"/>
-        <w:jc w:val="center"/>
-      </w:pPr>
-      <w:r>
-        <w:rPr>
-          <w:rFonts w:ascii="Arial" w:hAnsi="Arial"/>
-          <w:b w:val="0"/>
-          <w:sz w:val="20"/>
-        </w:rPr>
-        <w:t>Figura 25 — Resultado do método de Jacobi com explicação do Clark Calc — parte 2</w:t>
-      </w:r>
-    </w:p>
-    <w:p>
-      <w:pPr>
-        <w:spacing w:before="60" w:after="120" w:line="360" w:lineRule="auto"/>
-        <w:ind w:firstLine="0"/>
-        <w:jc w:val="center"/>
-      </w:pPr>
-      <w:r>
-        <w:rPr>
-          <w:rFonts w:ascii="Arial" w:hAnsi="Arial"/>
-          <w:b w:val="0"/>
-          <w:sz w:val="20"/>
-        </w:rPr>
-        <w:t>Fonte: Os autores (2025)</w:t>
-      </w:r>
-    </w:p>
-    <w:p/>
-    <w:p>
-      <w:pPr>
-        <w:spacing w:before="120" w:after="60" w:line="360" w:lineRule="auto"/>
-        <w:ind w:firstLine="0"/>
-        <w:jc w:val="left"/>
+        <w:spacing w:before="0" w:after="0" w:line="360" w:lineRule="auto"/>
+        <w:ind w:firstLine="0" w:left="709"/>
+        <w:jc w:val="both"/>
       </w:pPr>
       <w:r>
         <w:rPr>
           <w:rFonts w:ascii="Arial" w:hAnsi="Arial"/>
           <w:b/>
+          <w:i w:val="0"/>
           <w:sz w:val="24"/>
         </w:rPr>
-        <w:t>4.4 Gauss-Seidel</w:t>
+        <w:t>Newton-Raphson:</w:t>
       </w:r>
-    </w:p>
-    <w:p>
-      <w:pPr>
-        <w:spacing w:before="0" w:after="0" w:line="360" w:lineRule="auto"/>
-        <w:ind w:firstLine="709"/>
-        <w:jc w:val="both"/>
-      </w:pPr>
       <w:r>
         <w:rPr>
           <w:rFonts w:ascii="Arial" w:hAnsi="Arial"/>
@@ -2540,100 +1342,32 @@
           <w:i w:val="0"/>
           <w:sz w:val="24"/>
         </w:rPr>
-        <w:t>O método de Gauss-Seidel é semelhante ao método de Jacobi, porém cada variável é atualizada imediatamente após ser calculada, utilizando os valores mais recentes disponíveis nas iterações seguintes. Essa estratégia geralmente resulta em convergência mais rápida do que o método de Jacobi. Aplica-se a mesma condição de convergência de dominância diagonal estrita.</w:t>
+        <w:t xml:space="preserve"> requer apenas um valor inicial x₀; a derivada é calculada automaticamente;</w:t>
       </w:r>
     </w:p>
-    <w:p/>
     <w:p>
       <w:pPr>
-        <w:spacing w:before="60" w:after="120" w:line="360" w:lineRule="auto"/>
-        <w:ind w:firstLine="0"/>
-        <w:jc w:val="center"/>
-      </w:pPr>
+        <w:spacing w:before="0" w:after="0" w:line="360" w:lineRule="auto"/>
+        <w:ind w:firstLine="0" w:left="709"/>
+        <w:jc w:val="both"/>
+      </w:pPr>
+      <w:r>
+        <w:rPr>
+          <w:rFonts w:ascii="Arial" w:hAnsi="Arial"/>
+          <w:b/>
+          <w:i w:val="0"/>
+          <w:sz w:val="24"/>
+        </w:rPr>
+        <w:t>Secantes:</w:t>
+      </w:r>
       <w:r>
         <w:rPr>
           <w:rFonts w:ascii="Arial" w:hAnsi="Arial"/>
           <w:b w:val="0"/>
-          <w:sz w:val="20"/>
+          <w:i w:val="0"/>
+          <w:sz w:val="24"/>
         </w:rPr>
-        <w:t>Figura 26 — Formulário do método de Gauss-Seidel</w:t>
-      </w:r>
-    </w:p>
-    <w:p>
-      <w:pPr>
-        <w:spacing w:before="60" w:after="120" w:line="360" w:lineRule="auto"/>
-        <w:ind w:firstLine="0"/>
-        <w:jc w:val="center"/>
-      </w:pPr>
-      <w:r>
-        <w:rPr>
-          <w:rFonts w:ascii="Arial" w:hAnsi="Arial"/>
-          <w:b w:val="0"/>
-          <w:sz w:val="20"/>
-        </w:rPr>
-        <w:t>Fonte: Os autores (2025)</w:t>
-      </w:r>
-    </w:p>
-    <w:p/>
-    <w:p>
-      <w:pPr>
-        <w:spacing w:before="60" w:after="120" w:line="360" w:lineRule="auto"/>
-        <w:ind w:firstLine="0"/>
-        <w:jc w:val="center"/>
-      </w:pPr>
-      <w:r>
-        <w:rPr>
-          <w:rFonts w:ascii="Arial" w:hAnsi="Arial"/>
-          <w:b w:val="0"/>
-          <w:sz w:val="20"/>
-        </w:rPr>
-        <w:t>Figura 27 — Resultado do método de Gauss-Seidel com explicação do Clark Calc — parte 1</w:t>
-      </w:r>
-    </w:p>
-    <w:p>
-      <w:pPr>
-        <w:spacing w:before="60" w:after="120" w:line="360" w:lineRule="auto"/>
-        <w:ind w:firstLine="0"/>
-        <w:jc w:val="center"/>
-      </w:pPr>
-      <w:r>
-        <w:rPr>
-          <w:rFonts w:ascii="Arial" w:hAnsi="Arial"/>
-          <w:b w:val="0"/>
-          <w:sz w:val="20"/>
-        </w:rPr>
-        <w:t>Fonte: Os autores (2025)</w:t>
-      </w:r>
-    </w:p>
-    <w:p/>
-    <w:p>
-      <w:pPr>
-        <w:spacing w:before="60" w:after="120" w:line="360" w:lineRule="auto"/>
-        <w:ind w:firstLine="0"/>
-        <w:jc w:val="center"/>
-      </w:pPr>
-      <w:r>
-        <w:rPr>
-          <w:rFonts w:ascii="Arial" w:hAnsi="Arial"/>
-          <w:b w:val="0"/>
-          <w:sz w:val="20"/>
-        </w:rPr>
-        <w:t>Figura 28 — Resultado do método de Gauss-Seidel com explicação do Clark Calc — parte 2</w:t>
-      </w:r>
-    </w:p>
-    <w:p>
-      <w:pPr>
-        <w:spacing w:before="60" w:after="120" w:line="360" w:lineRule="auto"/>
-        <w:ind w:firstLine="0"/>
-        <w:jc w:val="center"/>
-      </w:pPr>
-      <w:r>
-        <w:rPr>
-          <w:rFonts w:ascii="Arial" w:hAnsi="Arial"/>
-          <w:b w:val="0"/>
-          <w:sz w:val="20"/>
-        </w:rPr>
-        <w:t>Fonte: Os autores (2025)</w:t>
+        <w:t xml:space="preserve"> requer dois valores iniciais x₀ e x₁ distintos.</w:t>
       </w:r>
     </w:p>
     <w:p>
@@ -2643,7 +1377,7 @@
     </w:p>
     <w:p>
       <w:pPr>
-        <w:spacing w:before="240" w:after="120" w:line="360" w:lineRule="auto"/>
+        <w:spacing w:before="360" w:after="120" w:line="360" w:lineRule="auto"/>
         <w:ind w:firstLine="0"/>
         <w:jc w:val="left"/>
       </w:pPr>
@@ -2651,9 +1385,10 @@
         <w:rPr>
           <w:rFonts w:ascii="Arial" w:hAnsi="Arial"/>
           <w:b/>
+          <w:i w:val="0"/>
           <w:sz w:val="24"/>
         </w:rPr>
-        <w:t>5 MÓDULO: AJUSTE DE CURVAS</w:t>
+        <w:t>5 MÓDULO: SISTEMAS LINEARES</w:t>
       </w:r>
     </w:p>
     <w:p>
@@ -2669,15 +1404,49 @@
           <w:i w:val="0"/>
           <w:sz w:val="24"/>
         </w:rPr>
-        <w:t>Este módulo calcula os coeficientes de ajuste para conjuntos de dados experimentais, determinando a curva que melhor representa os pontos fornecidos pelo usuário segundo o critério dos mínimos quadrados.</w:t>
+        <w:t>Este módulo resolve sistemas de equações lineares da forma Ax = b, onde A é a matriz de coeficientes e b é o vetor de termos independentes.</w:t>
       </w:r>
     </w:p>
     <w:p>
       <w:pPr>
+        <w:spacing w:before="240" w:after="60" w:line="360" w:lineRule="auto"/>
+        <w:ind w:firstLine="0"/>
+        <w:jc w:val="left"/>
+      </w:pPr>
+      <w:r>
+        <w:rPr>
+          <w:rFonts w:ascii="Arial" w:hAnsi="Arial"/>
+          <w:b/>
+          <w:i w:val="0"/>
+          <w:sz w:val="24"/>
+        </w:rPr>
+        <w:t>5.1 Como usar</w:t>
+      </w:r>
+    </w:p>
+    <w:p>
+      <w:pPr>
         <w:spacing w:before="0" w:after="0" w:line="360" w:lineRule="auto"/>
-        <w:ind w:firstLine="709"/>
+        <w:ind w:firstLine="0" w:left="709"/>
         <w:jc w:val="both"/>
       </w:pPr>
+      <w:r>
+        <w:rPr>
+          <w:rFonts w:ascii="Arial" w:hAnsi="Arial"/>
+          <w:b/>
+          <w:i w:val="0"/>
+          <w:sz w:val="24"/>
+        </w:rPr>
+        <w:t xml:space="preserve">1. </w:t>
+      </w:r>
+      <w:r>
+        <w:rPr>
+          <w:rFonts w:ascii="Arial" w:hAnsi="Arial"/>
+          <w:b/>
+          <w:i w:val="0"/>
+          <w:sz w:val="24"/>
+        </w:rPr>
+        <w:t>Informe a dimensão n</w:t>
+      </w:r>
       <w:r>
         <w:rPr>
           <w:rFonts w:ascii="Arial" w:hAnsi="Arial"/>
@@ -2685,31 +1454,33 @@
           <w:i w:val="0"/>
           <w:sz w:val="24"/>
         </w:rPr>
-        <w:t>Para ambos os métodos, o procedimento consiste em: informar os pares de pontos (x, y), selecionar o método desejado e clicar em "AJUSTAR".</w:t>
+        <w:t xml:space="preserve"> do sistema (número de equações/incógnitas);</w:t>
       </w:r>
     </w:p>
-    <w:p/>
     <w:p>
       <w:pPr>
-        <w:spacing w:before="120" w:after="60" w:line="360" w:lineRule="auto"/>
-        <w:ind w:firstLine="0"/>
-        <w:jc w:val="left"/>
+        <w:spacing w:before="0" w:after="0" w:line="360" w:lineRule="auto"/>
+        <w:ind w:firstLine="0" w:left="709"/>
+        <w:jc w:val="both"/>
       </w:pPr>
       <w:r>
         <w:rPr>
           <w:rFonts w:ascii="Arial" w:hAnsi="Arial"/>
           <w:b/>
+          <w:i w:val="0"/>
           <w:sz w:val="24"/>
         </w:rPr>
-        <w:t>5.1 Regressão Linear</w:t>
+        <w:t xml:space="preserve">2. </w:t>
       </w:r>
-    </w:p>
-    <w:p>
-      <w:pPr>
-        <w:spacing w:before="0" w:after="0" w:line="360" w:lineRule="auto"/>
-        <w:ind w:firstLine="709"/>
-        <w:jc w:val="both"/>
-      </w:pPr>
+      <w:r>
+        <w:rPr>
+          <w:rFonts w:ascii="Arial" w:hAnsi="Arial"/>
+          <w:b/>
+          <w:i w:val="0"/>
+          <w:sz w:val="24"/>
+        </w:rPr>
+        <w:t>Preencha a matriz A</w:t>
+      </w:r>
       <w:r>
         <w:rPr>
           <w:rFonts w:ascii="Arial" w:hAnsi="Arial"/>
@@ -2717,13 +1488,81 @@
           <w:i w:val="0"/>
           <w:sz w:val="24"/>
         </w:rPr>
-        <w:t>A Regressão Linear ajusta uma reta y = a₀ + a₁x ao conjunto de pontos, minimizando a soma dos quadrados dos resíduos (diferenças entre os valores observados e os valores preditos pelo modelo). É indicada quando os dados apresentam tendência aproximadamente linear.</w:t>
+        <w:t xml:space="preserve"> (n × n) e o vetor b (n × 1);</w:t>
+      </w:r>
+    </w:p>
+    <w:p>
+      <w:pPr>
+        <w:spacing w:before="0" w:after="0" w:line="360" w:lineRule="auto"/>
+        <w:ind w:firstLine="0" w:left="709"/>
+        <w:jc w:val="both"/>
+      </w:pPr>
+      <w:r>
+        <w:rPr>
+          <w:rFonts w:ascii="Arial" w:hAnsi="Arial"/>
+          <w:b/>
+          <w:i w:val="0"/>
+          <w:sz w:val="24"/>
+        </w:rPr>
+        <w:t xml:space="preserve">3. </w:t>
+      </w:r>
+      <w:r>
+        <w:rPr>
+          <w:rFonts w:ascii="Arial" w:hAnsi="Arial"/>
+          <w:b/>
+          <w:i w:val="0"/>
+          <w:sz w:val="24"/>
+        </w:rPr>
+        <w:t>Selecione o método;</w:t>
+      </w:r>
+      <w:r>
+        <w:rPr>
+          <w:rFonts w:ascii="Arial" w:hAnsi="Arial"/>
+          <w:b w:val="0"/>
+          <w:i w:val="0"/>
+          <w:sz w:val="24"/>
+        </w:rPr>
+        <w:t xml:space="preserve"> </w:t>
+      </w:r>
+    </w:p>
+    <w:p>
+      <w:pPr>
+        <w:spacing w:before="0" w:after="0" w:line="360" w:lineRule="auto"/>
+        <w:ind w:firstLine="0" w:left="709"/>
+        <w:jc w:val="both"/>
+      </w:pPr>
+      <w:r>
+        <w:rPr>
+          <w:rFonts w:ascii="Arial" w:hAnsi="Arial"/>
+          <w:b/>
+          <w:i w:val="0"/>
+          <w:sz w:val="24"/>
+        </w:rPr>
+        <w:t xml:space="preserve">4. </w:t>
+      </w:r>
+      <w:r>
+        <w:rPr>
+          <w:rFonts w:ascii="Arial" w:hAnsi="Arial"/>
+          <w:b/>
+          <w:i w:val="0"/>
+          <w:sz w:val="24"/>
+        </w:rPr>
+        <w:t>Clique em</w:t>
+      </w:r>
+      <w:r>
+        <w:rPr>
+          <w:rFonts w:ascii="Arial" w:hAnsi="Arial"/>
+          <w:b w:val="0"/>
+          <w:i w:val="0"/>
+          <w:sz w:val="24"/>
+        </w:rPr>
+        <w:t xml:space="preserve"> "RESOLVER".</w:t>
       </w:r>
     </w:p>
     <w:p/>
     <w:p>
       <w:pPr>
-        <w:spacing w:before="60" w:after="120" w:line="360" w:lineRule="auto"/>
+        <w:spacing w:before="60" w:after="60" w:line="240" w:lineRule="auto"/>
         <w:ind w:firstLine="0"/>
         <w:jc w:val="center"/>
       </w:pPr>
@@ -2731,14 +1570,15 @@
         <w:rPr>
           <w:rFonts w:ascii="Arial" w:hAnsi="Arial"/>
           <w:b w:val="0"/>
+          <w:i w:val="0"/>
           <w:sz w:val="20"/>
         </w:rPr>
-        <w:t>Figura 29 — Formulário da Regressão Linear</w:t>
+        <w:t>Figura 4 — Formulário do módulo de Sistemas Lineares</w:t>
       </w:r>
     </w:p>
     <w:p>
       <w:pPr>
-        <w:spacing w:before="60" w:after="120" w:line="360" w:lineRule="auto"/>
+        <w:spacing w:before="60" w:after="60" w:line="240" w:lineRule="auto"/>
         <w:ind w:firstLine="0"/>
         <w:jc w:val="center"/>
       </w:pPr>
@@ -2746,6 +1586,7 @@
         <w:rPr>
           <w:rFonts w:ascii="Arial" w:hAnsi="Arial"/>
           <w:b w:val="0"/>
+          <w:i w:val="0"/>
           <w:sz w:val="20"/>
         </w:rPr>
         <w:t>Fonte: Os autores (2025)</w:t>
@@ -2754,7 +1595,7 @@
     <w:p/>
     <w:p>
       <w:pPr>
-        <w:spacing w:before="60" w:after="120" w:line="360" w:lineRule="auto"/>
+        <w:spacing w:before="60" w:after="60" w:line="240" w:lineRule="auto"/>
         <w:ind w:firstLine="0"/>
         <w:jc w:val="center"/>
       </w:pPr>
@@ -2762,14 +1603,15 @@
         <w:rPr>
           <w:rFonts w:ascii="Arial" w:hAnsi="Arial"/>
           <w:b w:val="0"/>
+          <w:i w:val="0"/>
           <w:sz w:val="20"/>
         </w:rPr>
-        <w:t>Figura 30 — Resultado da Regressão Linear com explicação do Clark Calc — parte 1</w:t>
+        <w:t>Figura 5 — Resultado do cálculo e explicação do Clark Calc</w:t>
       </w:r>
     </w:p>
     <w:p>
       <w:pPr>
-        <w:spacing w:before="60" w:after="120" w:line="360" w:lineRule="auto"/>
+        <w:spacing w:before="60" w:after="60" w:line="240" w:lineRule="auto"/>
         <w:ind w:firstLine="0"/>
         <w:jc w:val="center"/>
       </w:pPr>
@@ -2777,46 +1619,15 @@
         <w:rPr>
           <w:rFonts w:ascii="Arial" w:hAnsi="Arial"/>
           <w:b w:val="0"/>
+          <w:i w:val="0"/>
           <w:sz w:val="20"/>
         </w:rPr>
         <w:t>Fonte: Os autores (2025)</w:t>
       </w:r>
     </w:p>
-    <w:p/>
     <w:p>
       <w:pPr>
-        <w:spacing w:before="60" w:after="120" w:line="360" w:lineRule="auto"/>
-        <w:ind w:firstLine="0"/>
-        <w:jc w:val="center"/>
-      </w:pPr>
-      <w:r>
-        <w:rPr>
-          <w:rFonts w:ascii="Arial" w:hAnsi="Arial"/>
-          <w:b w:val="0"/>
-          <w:sz w:val="20"/>
-        </w:rPr>
-        <w:t>Figura 31 — Resultado da Regressão Linear com explicação do Clark Calc — parte 2</w:t>
-      </w:r>
-    </w:p>
-    <w:p>
-      <w:pPr>
-        <w:spacing w:before="60" w:after="120" w:line="360" w:lineRule="auto"/>
-        <w:ind w:firstLine="0"/>
-        <w:jc w:val="center"/>
-      </w:pPr>
-      <w:r>
-        <w:rPr>
-          <w:rFonts w:ascii="Arial" w:hAnsi="Arial"/>
-          <w:b w:val="0"/>
-          <w:sz w:val="20"/>
-        </w:rPr>
-        <w:t>Fonte: Os autores (2025)</w:t>
-      </w:r>
-    </w:p>
-    <w:p/>
-    <w:p>
-      <w:pPr>
-        <w:spacing w:before="120" w:after="60" w:line="360" w:lineRule="auto"/>
+        <w:spacing w:before="240" w:after="60" w:line="360" w:lineRule="auto"/>
         <w:ind w:firstLine="0"/>
         <w:jc w:val="left"/>
       </w:pPr>
@@ -2824,17 +1635,27 @@
         <w:rPr>
           <w:rFonts w:ascii="Arial" w:hAnsi="Arial"/>
           <w:b/>
+          <w:i w:val="0"/>
           <w:sz w:val="24"/>
         </w:rPr>
-        <w:t>5.2 Mínimos Quadrados Polinomial</w:t>
+        <w:t>5.2 Métodos disponíveis</w:t>
       </w:r>
     </w:p>
     <w:p>
       <w:pPr>
         <w:spacing w:before="0" w:after="0" w:line="360" w:lineRule="auto"/>
-        <w:ind w:firstLine="709"/>
+        <w:ind w:firstLine="0" w:left="709"/>
         <w:jc w:val="both"/>
       </w:pPr>
+      <w:r>
+        <w:rPr>
+          <w:rFonts w:ascii="Arial" w:hAnsi="Arial"/>
+          <w:b/>
+          <w:i w:val="0"/>
+          <w:sz w:val="24"/>
+        </w:rPr>
+        <w:t>Eliminação de Gauss com Pivoteamento:</w:t>
+      </w:r>
       <w:r>
         <w:rPr>
           <w:rFonts w:ascii="Arial" w:hAnsi="Arial"/>
@@ -2842,69 +1663,82 @@
           <w:i w:val="0"/>
           <w:sz w:val="24"/>
         </w:rPr>
-        <w:t>O método dos Mínimos Quadrados Polinomial ajusta um polinômio de grau n ao conjunto de pontos. O usuário define o grau do polinômio; graus mais elevados permitem ajustes mais precisos para dados não lineares, porém podem produzir overfitting (sobreajuste) quando o número de pontos for pequeno em relação ao grau escolhido.</w:t>
+        <w:t xml:space="preserve"> método direto; não requer parâmetros adicionais;</w:t>
       </w:r>
     </w:p>
-    <w:p/>
     <w:p>
       <w:pPr>
-        <w:spacing w:before="60" w:after="120" w:line="360" w:lineRule="auto"/>
-        <w:ind w:firstLine="0"/>
-        <w:jc w:val="center"/>
-      </w:pPr>
+        <w:spacing w:before="0" w:after="0" w:line="360" w:lineRule="auto"/>
+        <w:ind w:firstLine="0" w:left="709"/>
+        <w:jc w:val="both"/>
+      </w:pPr>
+      <w:r>
+        <w:rPr>
+          <w:rFonts w:ascii="Arial" w:hAnsi="Arial"/>
+          <w:b/>
+          <w:i w:val="0"/>
+          <w:sz w:val="24"/>
+        </w:rPr>
+        <w:t>Fatoração LU:</w:t>
+      </w:r>
       <w:r>
         <w:rPr>
           <w:rFonts w:ascii="Arial" w:hAnsi="Arial"/>
           <w:b w:val="0"/>
-          <w:sz w:val="20"/>
+          <w:i w:val="0"/>
+          <w:sz w:val="24"/>
         </w:rPr>
-        <w:t>Figura 32 — Formulário dos Mínimos Quadrados Polinomial</w:t>
+        <w:t xml:space="preserve"> método direto; não requer parâmetros adicionais;</w:t>
       </w:r>
     </w:p>
     <w:p>
       <w:pPr>
-        <w:spacing w:before="60" w:after="120" w:line="360" w:lineRule="auto"/>
-        <w:ind w:firstLine="0"/>
-        <w:jc w:val="center"/>
-      </w:pPr>
+        <w:spacing w:before="0" w:after="0" w:line="360" w:lineRule="auto"/>
+        <w:ind w:firstLine="0" w:left="709"/>
+        <w:jc w:val="both"/>
+      </w:pPr>
+      <w:r>
+        <w:rPr>
+          <w:rFonts w:ascii="Arial" w:hAnsi="Arial"/>
+          <w:b/>
+          <w:i w:val="0"/>
+          <w:sz w:val="24"/>
+        </w:rPr>
+        <w:t>Jacobi:</w:t>
+      </w:r>
       <w:r>
         <w:rPr>
           <w:rFonts w:ascii="Arial" w:hAnsi="Arial"/>
           <w:b w:val="0"/>
-          <w:sz w:val="20"/>
+          <w:i w:val="0"/>
+          <w:sz w:val="24"/>
         </w:rPr>
-        <w:t>Fonte: Os autores (2025)</w:t>
+        <w:t xml:space="preserve"> método iterativo; requer tolerância e número máximo de iterações;</w:t>
       </w:r>
     </w:p>
-    <w:p/>
     <w:p>
       <w:pPr>
-        <w:spacing w:before="60" w:after="120" w:line="360" w:lineRule="auto"/>
-        <w:ind w:firstLine="0"/>
-        <w:jc w:val="center"/>
-      </w:pPr>
+        <w:spacing w:before="0" w:after="0" w:line="360" w:lineRule="auto"/>
+        <w:ind w:firstLine="0" w:left="709"/>
+        <w:jc w:val="both"/>
+      </w:pPr>
+      <w:r>
+        <w:rPr>
+          <w:rFonts w:ascii="Arial" w:hAnsi="Arial"/>
+          <w:b/>
+          <w:i w:val="0"/>
+          <w:sz w:val="24"/>
+        </w:rPr>
+        <w:t>Gauss-Seidel:</w:t>
+      </w:r>
       <w:r>
         <w:rPr>
           <w:rFonts w:ascii="Arial" w:hAnsi="Arial"/>
           <w:b w:val="0"/>
-          <w:sz w:val="20"/>
+          <w:i w:val="0"/>
+          <w:sz w:val="24"/>
         </w:rPr>
-        <w:t>Figura 33 — Resultado dos Mínimos Quadrados Polinomial com explicação do Clark Calc</w:t>
-      </w:r>
-    </w:p>
-    <w:p>
-      <w:pPr>
-        <w:spacing w:before="60" w:after="120" w:line="360" w:lineRule="auto"/>
-        <w:ind w:firstLine="0"/>
-        <w:jc w:val="center"/>
-      </w:pPr>
-      <w:r>
-        <w:rPr>
-          <w:rFonts w:ascii="Arial" w:hAnsi="Arial"/>
-          <w:b w:val="0"/>
-          <w:sz w:val="20"/>
-        </w:rPr>
-        <w:t>Fonte: Os autores (2025)</w:t>
+        <w:t xml:space="preserve"> método iterativo; requer tolerância e número máximo de iterações.</w:t>
       </w:r>
     </w:p>
     <w:p>
@@ -2914,7 +1748,7 @@
     </w:p>
     <w:p>
       <w:pPr>
-        <w:spacing w:before="240" w:after="120" w:line="360" w:lineRule="auto"/>
+        <w:spacing w:before="360" w:after="120" w:line="360" w:lineRule="auto"/>
         <w:ind w:firstLine="0"/>
         <w:jc w:val="left"/>
       </w:pPr>
@@ -2922,9 +1756,10 @@
         <w:rPr>
           <w:rFonts w:ascii="Arial" w:hAnsi="Arial"/>
           <w:b/>
+          <w:i w:val="0"/>
           <w:sz w:val="24"/>
         </w:rPr>
-        <w:t>6 ASSISTENTE CLARK CALC</w:t>
+        <w:t>6 MÓDULO: AJUSTE DE CURVAS</w:t>
       </w:r>
     </w:p>
     <w:p>
@@ -2940,13 +1775,12 @@
           <w:i w:val="0"/>
           <w:sz w:val="24"/>
         </w:rPr>
-        <w:t>O Clark Calc é o assistente de inteligência artificial integrado ao SuperMath, alimentado pelo modelo de linguagem Llama 3.3 70B disponibilizado via API do Groq. O assistente opera com acesso em tempo real aos dados exibidos na interface, sendo capaz de analisar os cálculos realizados, explicar os métodos passo a passo e identificar as causas de falhas matemáticas.</w:t>
+        <w:t>Este módulo encontra a curva que melhor representa um conjunto de pontos experimentais informados pelo usuário.</w:t>
       </w:r>
     </w:p>
-    <w:p/>
     <w:p>
       <w:pPr>
-        <w:spacing w:before="120" w:after="60" w:line="360" w:lineRule="auto"/>
+        <w:spacing w:before="240" w:after="60" w:line="360" w:lineRule="auto"/>
         <w:ind w:firstLine="0"/>
         <w:jc w:val="left"/>
       </w:pPr>
@@ -2954,17 +1788,36 @@
         <w:rPr>
           <w:rFonts w:ascii="Arial" w:hAnsi="Arial"/>
           <w:b/>
+          <w:i w:val="0"/>
           <w:sz w:val="24"/>
         </w:rPr>
-        <w:t>6.1 Como Acionar</w:t>
+        <w:t>6.1 Como usar</w:t>
       </w:r>
     </w:p>
     <w:p>
       <w:pPr>
         <w:spacing w:before="0" w:after="0" w:line="360" w:lineRule="auto"/>
-        <w:ind w:firstLine="709"/>
+        <w:ind w:firstLine="0" w:left="709"/>
         <w:jc w:val="both"/>
       </w:pPr>
+      <w:r>
+        <w:rPr>
+          <w:rFonts w:ascii="Arial" w:hAnsi="Arial"/>
+          <w:b/>
+          <w:i w:val="0"/>
+          <w:sz w:val="24"/>
+        </w:rPr>
+        <w:t xml:space="preserve">1. </w:t>
+      </w:r>
+      <w:r>
+        <w:rPr>
+          <w:rFonts w:ascii="Arial" w:hAnsi="Arial"/>
+          <w:b/>
+          <w:i w:val="0"/>
+          <w:sz w:val="24"/>
+        </w:rPr>
+        <w:t>Insira os pontos</w:t>
+      </w:r>
       <w:r>
         <w:rPr>
           <w:rFonts w:ascii="Arial" w:hAnsi="Arial"/>
@@ -2972,13 +1825,266 @@
           <w:i w:val="0"/>
           <w:sz w:val="24"/>
         </w:rPr>
-        <w:t>O Clark Calc pode ser acionado de duas formas:</w:t>
+        <w:t xml:space="preserve"> (x, y) no formulário;</w:t>
       </w:r>
     </w:p>
     <w:p>
       <w:pPr>
         <w:spacing w:before="0" w:after="0" w:line="360" w:lineRule="auto"/>
-        <w:ind w:left="709"/>
+        <w:ind w:firstLine="0" w:left="709"/>
+        <w:jc w:val="both"/>
+      </w:pPr>
+      <w:r>
+        <w:rPr>
+          <w:rFonts w:ascii="Arial" w:hAnsi="Arial"/>
+          <w:b/>
+          <w:i w:val="0"/>
+          <w:sz w:val="24"/>
+        </w:rPr>
+        <w:t xml:space="preserve">2. </w:t>
+      </w:r>
+      <w:r>
+        <w:rPr>
+          <w:rFonts w:ascii="Arial" w:hAnsi="Arial"/>
+          <w:b/>
+          <w:i w:val="0"/>
+          <w:sz w:val="24"/>
+        </w:rPr>
+        <w:t>Selecione o método;</w:t>
+      </w:r>
+      <w:r>
+        <w:rPr>
+          <w:rFonts w:ascii="Arial" w:hAnsi="Arial"/>
+          <w:b w:val="0"/>
+          <w:i w:val="0"/>
+          <w:sz w:val="24"/>
+        </w:rPr>
+        <w:t xml:space="preserve"> </w:t>
+      </w:r>
+    </w:p>
+    <w:p>
+      <w:pPr>
+        <w:spacing w:before="0" w:after="0" w:line="360" w:lineRule="auto"/>
+        <w:ind w:firstLine="0" w:left="709"/>
+        <w:jc w:val="both"/>
+      </w:pPr>
+      <w:r>
+        <w:rPr>
+          <w:rFonts w:ascii="Arial" w:hAnsi="Arial"/>
+          <w:b/>
+          <w:i w:val="0"/>
+          <w:sz w:val="24"/>
+        </w:rPr>
+        <w:t xml:space="preserve">3. </w:t>
+      </w:r>
+      <w:r>
+        <w:rPr>
+          <w:rFonts w:ascii="Arial" w:hAnsi="Arial"/>
+          <w:b/>
+          <w:i w:val="0"/>
+          <w:sz w:val="24"/>
+        </w:rPr>
+        <w:t>Clique em</w:t>
+      </w:r>
+      <w:r>
+        <w:rPr>
+          <w:rFonts w:ascii="Arial" w:hAnsi="Arial"/>
+          <w:b w:val="0"/>
+          <w:i w:val="0"/>
+          <w:sz w:val="24"/>
+        </w:rPr>
+        <w:t xml:space="preserve"> "AJUSTAR".</w:t>
+      </w:r>
+    </w:p>
+    <w:p/>
+    <w:p>
+      <w:pPr>
+        <w:spacing w:before="60" w:after="60" w:line="240" w:lineRule="auto"/>
+        <w:ind w:firstLine="0"/>
+        <w:jc w:val="center"/>
+      </w:pPr>
+      <w:r>
+        <w:rPr>
+          <w:rFonts w:ascii="Arial" w:hAnsi="Arial"/>
+          <w:b w:val="0"/>
+          <w:i w:val="0"/>
+          <w:sz w:val="20"/>
+        </w:rPr>
+        <w:t>Figura 6 — Formulário do módulo de Ajuste de Curvas</w:t>
+      </w:r>
+    </w:p>
+    <w:p>
+      <w:pPr>
+        <w:spacing w:before="60" w:after="60" w:line="240" w:lineRule="auto"/>
+        <w:ind w:firstLine="0"/>
+        <w:jc w:val="center"/>
+      </w:pPr>
+      <w:r>
+        <w:rPr>
+          <w:rFonts w:ascii="Arial" w:hAnsi="Arial"/>
+          <w:b w:val="0"/>
+          <w:i w:val="0"/>
+          <w:sz w:val="20"/>
+        </w:rPr>
+        <w:t>Fonte: Os autores (2025)</w:t>
+      </w:r>
+    </w:p>
+    <w:p/>
+    <w:p>
+      <w:pPr>
+        <w:spacing w:before="60" w:after="60" w:line="240" w:lineRule="auto"/>
+        <w:ind w:firstLine="0"/>
+        <w:jc w:val="center"/>
+      </w:pPr>
+      <w:r>
+        <w:rPr>
+          <w:rFonts w:ascii="Arial" w:hAnsi="Arial"/>
+          <w:b w:val="0"/>
+          <w:i w:val="0"/>
+          <w:sz w:val="20"/>
+        </w:rPr>
+        <w:t>Figura 7 — Resultado do ajuste e gráfico gerado</w:t>
+      </w:r>
+    </w:p>
+    <w:p>
+      <w:pPr>
+        <w:spacing w:before="60" w:after="60" w:line="240" w:lineRule="auto"/>
+        <w:ind w:firstLine="0"/>
+        <w:jc w:val="center"/>
+      </w:pPr>
+      <w:r>
+        <w:rPr>
+          <w:rFonts w:ascii="Arial" w:hAnsi="Arial"/>
+          <w:b w:val="0"/>
+          <w:i w:val="0"/>
+          <w:sz w:val="20"/>
+        </w:rPr>
+        <w:t>Fonte: Os autores (2025)</w:t>
+      </w:r>
+    </w:p>
+    <w:p>
+      <w:pPr>
+        <w:spacing w:before="240" w:after="60" w:line="360" w:lineRule="auto"/>
+        <w:ind w:firstLine="0"/>
+        <w:jc w:val="left"/>
+      </w:pPr>
+      <w:r>
+        <w:rPr>
+          <w:rFonts w:ascii="Arial" w:hAnsi="Arial"/>
+          <w:b/>
+          <w:i w:val="0"/>
+          <w:sz w:val="24"/>
+        </w:rPr>
+        <w:t>6.2 Métodos disponíveis</w:t>
+      </w:r>
+    </w:p>
+    <w:p>
+      <w:pPr>
+        <w:spacing w:before="0" w:after="0" w:line="360" w:lineRule="auto"/>
+        <w:ind w:firstLine="0" w:left="709"/>
+        <w:jc w:val="both"/>
+      </w:pPr>
+      <w:r>
+        <w:rPr>
+          <w:rFonts w:ascii="Arial" w:hAnsi="Arial"/>
+          <w:b/>
+          <w:i w:val="0"/>
+          <w:sz w:val="24"/>
+        </w:rPr>
+        <w:t>Regressão Linear:</w:t>
+      </w:r>
+      <w:r>
+        <w:rPr>
+          <w:rFonts w:ascii="Arial" w:hAnsi="Arial"/>
+          <w:b w:val="0"/>
+          <w:i w:val="0"/>
+          <w:sz w:val="24"/>
+        </w:rPr>
+        <w:t xml:space="preserve"> ajusta uma reta aos dados; não requer parâmetros adicionais;</w:t>
+      </w:r>
+    </w:p>
+    <w:p>
+      <w:pPr>
+        <w:spacing w:before="0" w:after="0" w:line="360" w:lineRule="auto"/>
+        <w:ind w:firstLine="0" w:left="709"/>
+        <w:jc w:val="both"/>
+      </w:pPr>
+      <w:r>
+        <w:rPr>
+          <w:rFonts w:ascii="Arial" w:hAnsi="Arial"/>
+          <w:b/>
+          <w:i w:val="0"/>
+          <w:sz w:val="24"/>
+        </w:rPr>
+        <w:t>Mínimos Quadrados Polinomial:</w:t>
+      </w:r>
+      <w:r>
+        <w:rPr>
+          <w:rFonts w:ascii="Arial" w:hAnsi="Arial"/>
+          <w:b w:val="0"/>
+          <w:i w:val="0"/>
+          <w:sz w:val="24"/>
+        </w:rPr>
+        <w:t xml:space="preserve"> ajusta um polinômio; requer a definição do grau desejado.</w:t>
+      </w:r>
+    </w:p>
+    <w:p>
+      <w:r>
+        <w:br w:type="page"/>
+      </w:r>
+    </w:p>
+    <w:p>
+      <w:pPr>
+        <w:spacing w:before="360" w:after="120" w:line="360" w:lineRule="auto"/>
+        <w:ind w:firstLine="0"/>
+        <w:jc w:val="left"/>
+      </w:pPr>
+      <w:r>
+        <w:rPr>
+          <w:rFonts w:ascii="Arial" w:hAnsi="Arial"/>
+          <w:b/>
+          <w:i w:val="0"/>
+          <w:sz w:val="24"/>
+        </w:rPr>
+        <w:t>7 ASSISTENTE CLARK CALC</w:t>
+      </w:r>
+    </w:p>
+    <w:p>
+      <w:pPr>
+        <w:spacing w:before="0" w:after="0" w:line="360" w:lineRule="auto"/>
+        <w:ind w:firstLine="709"/>
+        <w:jc w:val="both"/>
+      </w:pPr>
+      <w:r>
+        <w:rPr>
+          <w:rFonts w:ascii="Arial" w:hAnsi="Arial"/>
+          <w:b w:val="0"/>
+          <w:i w:val="0"/>
+          <w:sz w:val="24"/>
+        </w:rPr>
+        <w:t>O Clark Calc é o assistente de inteligência artificial integrado ao SuperMath. Ele lê os dados da tela em tempo real e responde perguntas sobre os cálculos realizados na sessão.</w:t>
+      </w:r>
+    </w:p>
+    <w:p>
+      <w:pPr>
+        <w:spacing w:before="240" w:after="60" w:line="360" w:lineRule="auto"/>
+        <w:ind w:firstLine="0"/>
+        <w:jc w:val="left"/>
+      </w:pPr>
+      <w:r>
+        <w:rPr>
+          <w:rFonts w:ascii="Arial" w:hAnsi="Arial"/>
+          <w:b/>
+          <w:i w:val="0"/>
+          <w:sz w:val="24"/>
+        </w:rPr>
+        <w:t>7.1 Como acionar</w:t>
+      </w:r>
+    </w:p>
+    <w:p>
+      <w:pPr>
+        <w:spacing w:before="0" w:after="0" w:line="360" w:lineRule="auto"/>
+        <w:ind w:firstLine="0" w:left="709"/>
         <w:jc w:val="both"/>
       </w:pPr>
       <w:r>
@@ -3006,13 +2112,13 @@
           <w:i w:val="0"/>
           <w:sz w:val="24"/>
         </w:rPr>
-        <w:t xml:space="preserve"> clique no botão ao lado do seletor de método para gerar automaticamente uma explicação sobre o algoritmo e o resultado atual;</w:t>
+        <w:t xml:space="preserve"> exibe automaticamente uma explicação sobre o método e o resultado atual;</w:t>
       </w:r>
     </w:p>
     <w:p>
       <w:pPr>
         <w:spacing w:before="0" w:after="0" w:line="360" w:lineRule="auto"/>
-        <w:ind w:left="709"/>
+        <w:ind w:firstLine="0" w:left="709"/>
         <w:jc w:val="both"/>
       </w:pPr>
       <w:r>
@@ -3031,7 +2137,7 @@
           <w:i w:val="0"/>
           <w:sz w:val="24"/>
         </w:rPr>
-        <w:t>Pergunta livre:</w:t>
+        <w:t>Campo de texto (barra lateral):</w:t>
       </w:r>
       <w:r>
         <w:rPr>
@@ -3040,13 +2146,13 @@
           <w:i w:val="0"/>
           <w:sz w:val="24"/>
         </w:rPr>
-        <w:t xml:space="preserve"> digite qualquer dúvida no campo de texto da barra lateral e pressione Enter para obter uma resposta contextual.</w:t>
+        <w:t xml:space="preserve"> digite qualquer pergunta e pressione Enter.</w:t>
       </w:r>
     </w:p>
     <w:p/>
     <w:p>
       <w:pPr>
-        <w:spacing w:before="60" w:after="120" w:line="360" w:lineRule="auto"/>
+        <w:spacing w:before="60" w:after="60" w:line="240" w:lineRule="auto"/>
         <w:ind w:firstLine="0"/>
         <w:jc w:val="center"/>
       </w:pPr>
@@ -3054,14 +2160,15 @@
         <w:rPr>
           <w:rFonts w:ascii="Arial" w:hAnsi="Arial"/>
           <w:b w:val="0"/>
+          <w:i w:val="0"/>
           <w:sz w:val="20"/>
         </w:rPr>
-        <w:t>Figura 34 — Clark Calc acionado pelo botão "Como funciona?"</w:t>
+        <w:t>Figura 8 — Clark Calc em uso na barra lateral</w:t>
       </w:r>
     </w:p>
     <w:p>
       <w:pPr>
-        <w:spacing w:before="60" w:after="120" w:line="360" w:lineRule="auto"/>
+        <w:spacing w:before="60" w:after="60" w:line="240" w:lineRule="auto"/>
         <w:ind w:firstLine="0"/>
         <w:jc w:val="center"/>
       </w:pPr>
@@ -3069,79 +2176,17 @@
         <w:rPr>
           <w:rFonts w:ascii="Arial" w:hAnsi="Arial"/>
           <w:b w:val="0"/>
+          <w:i w:val="0"/>
           <w:sz w:val="20"/>
         </w:rPr>
         <w:t>Fonte: Os autores (2025)</w:t>
       </w:r>
     </w:p>
-    <w:p/>
     <w:p>
       <w:pPr>
-        <w:spacing w:before="60" w:after="120" w:line="360" w:lineRule="auto"/>
-        <w:ind w:firstLine="0"/>
-        <w:jc w:val="center"/>
-      </w:pPr>
-      <w:r>
-        <w:rPr>
-          <w:rFonts w:ascii="Arial" w:hAnsi="Arial"/>
-          <w:b w:val="0"/>
-          <w:sz w:val="20"/>
-        </w:rPr>
-        <w:t>Figura 35 — Explicação detalhada gerada pelo Clark Calc</w:t>
-      </w:r>
-    </w:p>
-    <w:p>
-      <w:pPr>
-        <w:spacing w:before="60" w:after="120" w:line="360" w:lineRule="auto"/>
-        <w:ind w:firstLine="0"/>
-        <w:jc w:val="center"/>
-      </w:pPr>
-      <w:r>
-        <w:rPr>
-          <w:rFonts w:ascii="Arial" w:hAnsi="Arial"/>
-          <w:b w:val="0"/>
-          <w:sz w:val="20"/>
-        </w:rPr>
-        <w:t>Fonte: Os autores (2025)</w:t>
-      </w:r>
-    </w:p>
-    <w:p/>
-    <w:p>
-      <w:pPr>
-        <w:spacing w:before="120" w:after="60" w:line="360" w:lineRule="auto"/>
+        <w:spacing w:before="240" w:after="60" w:line="360" w:lineRule="auto"/>
         <w:ind w:firstLine="0"/>
         <w:jc w:val="left"/>
-      </w:pPr>
-      <w:r>
-        <w:rPr>
-          <w:rFonts w:ascii="Arial" w:hAnsi="Arial"/>
-          <w:b/>
-          <w:sz w:val="24"/>
-        </w:rPr>
-        <w:t>6.2 Capacidades</w:t>
-      </w:r>
-    </w:p>
-    <w:p>
-      <w:pPr>
-        <w:spacing w:before="0" w:after="0" w:line="360" w:lineRule="auto"/>
-        <w:ind w:firstLine="709"/>
-        <w:jc w:val="both"/>
-      </w:pPr>
-      <w:r>
-        <w:rPr>
-          <w:rFonts w:ascii="Arial" w:hAnsi="Arial"/>
-          <w:b w:val="0"/>
-          <w:i w:val="0"/>
-          <w:sz w:val="24"/>
-        </w:rPr>
-        <w:t>O Clark Calc é capaz de:</w:t>
-      </w:r>
-    </w:p>
-    <w:p>
-      <w:pPr>
-        <w:spacing w:before="0" w:after="0" w:line="360" w:lineRule="auto"/>
-        <w:ind w:left="709"/>
-        <w:jc w:val="both"/>
       </w:pPr>
       <w:r>
         <w:rPr>
@@ -3150,8 +2195,15 @@
           <w:i w:val="0"/>
           <w:sz w:val="24"/>
         </w:rPr>
-        <w:t xml:space="preserve">a) </w:t>
+        <w:t>7.2 O que ele faz</w:t>
       </w:r>
+    </w:p>
+    <w:p>
+      <w:pPr>
+        <w:spacing w:before="0" w:after="0" w:line="360" w:lineRule="auto"/>
+        <w:ind w:firstLine="0" w:left="709"/>
+        <w:jc w:val="both"/>
+      </w:pPr>
       <w:r>
         <w:rPr>
           <w:rFonts w:ascii="Arial" w:hAnsi="Arial"/>
@@ -3159,7 +2211,7 @@
           <w:i w:val="0"/>
           <w:sz w:val="24"/>
         </w:rPr>
-        <w:t>Análise contextual:</w:t>
+        <w:t>Explica o resultado:</w:t>
       </w:r>
       <w:r>
         <w:rPr>
@@ -3168,13 +2220,13 @@
           <w:i w:val="0"/>
           <w:sz w:val="24"/>
         </w:rPr>
-        <w:t xml:space="preserve"> lê tabelas, matrizes e mensagens de erro exibidos na tela em tempo real;</w:t>
+        <w:t xml:space="preserve"> detalha como o algoritmo chegou à solução exibida;</w:t>
       </w:r>
     </w:p>
     <w:p>
       <w:pPr>
         <w:spacing w:before="0" w:after="0" w:line="360" w:lineRule="auto"/>
-        <w:ind w:left="709"/>
+        <w:ind w:firstLine="0" w:left="709"/>
         <w:jc w:val="both"/>
       </w:pPr>
       <w:r>
@@ -3184,16 +2236,7 @@
           <w:i w:val="0"/>
           <w:sz w:val="24"/>
         </w:rPr>
-        <w:t xml:space="preserve">b) </w:t>
-      </w:r>
-      <w:r>
-        <w:rPr>
-          <w:rFonts w:ascii="Arial" w:hAnsi="Arial"/>
-          <w:b/>
-          <w:i w:val="0"/>
-          <w:sz w:val="24"/>
-        </w:rPr>
-        <w:t>Explicação passo a passo:</w:t>
+        <w:t>Diagnostica erros:</w:t>
       </w:r>
       <w:r>
         <w:rPr>
@@ -3202,13 +2245,13 @@
           <w:i w:val="0"/>
           <w:sz w:val="24"/>
         </w:rPr>
-        <w:t xml:space="preserve"> detalha como o algoritmo chegou ao resultado apresentado;</w:t>
+        <w:t xml:space="preserve"> identifica falhas como matriz singular, divergência ou intervalo inválido;</w:t>
       </w:r>
     </w:p>
     <w:p>
       <w:pPr>
         <w:spacing w:before="0" w:after="0" w:line="360" w:lineRule="auto"/>
-        <w:ind w:left="709"/>
+        <w:ind w:firstLine="0" w:left="709"/>
         <w:jc w:val="both"/>
       </w:pPr>
       <w:r>
@@ -3218,16 +2261,7 @@
           <w:i w:val="0"/>
           <w:sz w:val="24"/>
         </w:rPr>
-        <w:t xml:space="preserve">c) </w:t>
-      </w:r>
-      <w:r>
-        <w:rPr>
-          <w:rFonts w:ascii="Arial" w:hAnsi="Arial"/>
-          <w:b/>
-          <w:i w:val="0"/>
-          <w:sz w:val="24"/>
-        </w:rPr>
-        <w:t>Diagnóstico de erros:</w:t>
+        <w:t>Responde dúvidas:</w:t>
       </w:r>
       <w:r>
         <w:rPr>
@@ -3236,33 +2270,15 @@
           <w:i w:val="0"/>
           <w:sz w:val="24"/>
         </w:rPr>
-        <w:t xml:space="preserve"> identifica e explica falhas como divisão por zero, matriz singular ou divergência do método iterativo;</w:t>
+        <w:t xml:space="preserve"> esclarece perguntas sobre qualquer método ou conceito presente na tela.</w:t>
       </w:r>
     </w:p>
     <w:p>
       <w:pPr>
         <w:spacing w:before="0" w:after="0" w:line="360" w:lineRule="auto"/>
-        <w:ind w:left="709"/>
+        <w:ind w:firstLine="709"/>
         <w:jc w:val="both"/>
       </w:pPr>
-      <w:r>
-        <w:rPr>
-          <w:rFonts w:ascii="Arial" w:hAnsi="Arial"/>
-          <w:b/>
-          <w:i w:val="0"/>
-          <w:sz w:val="24"/>
-        </w:rPr>
-        <w:t xml:space="preserve">d) </w:t>
-      </w:r>
-      <w:r>
-        <w:rPr>
-          <w:rFonts w:ascii="Arial" w:hAnsi="Arial"/>
-          <w:b/>
-          <w:i w:val="0"/>
-          <w:sz w:val="24"/>
-        </w:rPr>
-        <w:t>Perguntas livres:</w:t>
-      </w:r>
       <w:r>
         <w:rPr>
           <w:rFonts w:ascii="Arial" w:hAnsi="Arial"/>
@@ -3270,23 +2286,7 @@
           <w:i w:val="0"/>
           <w:sz w:val="24"/>
         </w:rPr>
-        <w:t xml:space="preserve"> responde dúvidas sobre qualquer método ou conceito de cálculo numérico.</w:t>
-      </w:r>
-    </w:p>
-    <w:p>
-      <w:pPr>
-        <w:spacing w:before="0" w:after="0" w:line="360" w:lineRule="auto"/>
-        <w:ind w:firstLine="709"/>
-        <w:jc w:val="both"/>
-      </w:pPr>
-      <w:r>
-        <w:rPr>
-          <w:rFonts w:ascii="Arial" w:hAnsi="Arial"/>
-          <w:b w:val="0"/>
-          <w:i w:val="0"/>
-          <w:sz w:val="24"/>
-        </w:rPr>
-        <w:t>Recomenda-se executar o cálculo desejado antes de acionar o assistente. O Clark Calc analisa os dados da sessão em tempo real e fornece respostas específicas ao resultado obtido, e não respostas genéricas sobre o método.</w:t>
+        <w:t>Recomenda-se executar o cálculo antes de acionar o assistente, para que ele analise o resultado específico da sessão.</w:t>
       </w:r>
     </w:p>
     <w:p>
@@ -3296,7 +2296,7 @@
     </w:p>
     <w:p>
       <w:pPr>
-        <w:spacing w:before="240" w:after="120" w:line="360" w:lineRule="auto"/>
+        <w:spacing w:before="360" w:after="120" w:line="360" w:lineRule="auto"/>
         <w:ind w:firstLine="0"/>
         <w:jc w:val="left"/>
       </w:pPr>
@@ -3304,9 +2304,10 @@
         <w:rPr>
           <w:rFonts w:ascii="Arial" w:hAnsi="Arial"/>
           <w:b/>
+          <w:i w:val="0"/>
           <w:sz w:val="24"/>
         </w:rPr>
-        <w:t>7 EXECUÇÃO LOCAL (OPCIONAL)</w:t>
+        <w:t>8 EXECUÇÃO LOCAL (OPCIONAL)</w:t>
       </w:r>
     </w:p>
     <w:p>
@@ -3322,130 +2323,15 @@
           <w:i w:val="0"/>
           <w:sz w:val="24"/>
         </w:rPr>
-        <w:t xml:space="preserve">O SuperMath está disponível publicamente em </w:t>
-      </w:r>
-      <w:r>
-        <w:rPr>
-          <w:rFonts w:ascii="Arial" w:hAnsi="Arial"/>
-          <w:b w:val="0"/>
-          <w:i/>
-          <w:sz w:val="24"/>
-        </w:rPr>
-        <w:t>https://supermath.streamlit.app/</w:t>
-      </w:r>
-      <w:r>
-        <w:rPr>
-          <w:rFonts w:ascii="Arial" w:hAnsi="Arial"/>
-          <w:b w:val="0"/>
-          <w:i w:val="0"/>
-          <w:sz w:val="24"/>
-        </w:rPr>
-        <w:t>, dispensando qualquer instalação. As instruções a seguir são destinadas àqueles que desejam executar o projeto em ambiente local.</w:t>
+        <w:t>O SuperMath já está disponível online (Seção 2). Para quem quiser rodar o projeto localmente, são necessários Python 3.8 ou superior e Git instalados.</w:t>
       </w:r>
     </w:p>
     <w:p/>
     <w:p>
       <w:pPr>
-        <w:spacing w:before="120" w:after="60" w:line="360" w:lineRule="auto"/>
-        <w:ind w:firstLine="0"/>
+        <w:spacing w:before="120" w:after="0" w:line="360" w:lineRule="auto"/>
+        <w:ind w:firstLine="0" w:left="709"/>
         <w:jc w:val="left"/>
-      </w:pPr>
-      <w:r>
-        <w:rPr>
-          <w:rFonts w:ascii="Arial" w:hAnsi="Arial"/>
-          <w:b/>
-          <w:sz w:val="24"/>
-        </w:rPr>
-        <w:t>7.1 Pré-requisitos</w:t>
-      </w:r>
-    </w:p>
-    <w:p>
-      <w:pPr>
-        <w:spacing w:before="0" w:after="0" w:line="360" w:lineRule="auto"/>
-        <w:ind w:firstLine="709"/>
-        <w:jc w:val="both"/>
-      </w:pPr>
-      <w:r>
-        <w:rPr>
-          <w:rFonts w:ascii="Arial" w:hAnsi="Arial"/>
-          <w:b w:val="0"/>
-          <w:i w:val="0"/>
-          <w:sz w:val="24"/>
-        </w:rPr>
-        <w:t>Para executar o projeto localmente, são necessários:</w:t>
-      </w:r>
-    </w:p>
-    <w:p>
-      <w:pPr>
-        <w:spacing w:before="0" w:after="0" w:line="360" w:lineRule="auto"/>
-        <w:ind w:left="709"/>
-        <w:jc w:val="both"/>
-      </w:pPr>
-      <w:r>
-        <w:rPr>
-          <w:rFonts w:ascii="Arial" w:hAnsi="Arial"/>
-          <w:b/>
-          <w:i w:val="0"/>
-          <w:sz w:val="24"/>
-        </w:rPr>
-        <w:t xml:space="preserve">a) </w:t>
-      </w:r>
-      <w:r>
-        <w:rPr>
-          <w:rFonts w:ascii="Arial" w:hAnsi="Arial"/>
-          <w:b w:val="0"/>
-          <w:i w:val="0"/>
-          <w:sz w:val="24"/>
-        </w:rPr>
-        <w:t>Python 3.8 ou superior;</w:t>
-      </w:r>
-    </w:p>
-    <w:p>
-      <w:pPr>
-        <w:spacing w:before="0" w:after="0" w:line="360" w:lineRule="auto"/>
-        <w:ind w:left="709"/>
-        <w:jc w:val="both"/>
-      </w:pPr>
-      <w:r>
-        <w:rPr>
-          <w:rFonts w:ascii="Arial" w:hAnsi="Arial"/>
-          <w:b/>
-          <w:i w:val="0"/>
-          <w:sz w:val="24"/>
-        </w:rPr>
-        <w:t xml:space="preserve">b) </w:t>
-      </w:r>
-      <w:r>
-        <w:rPr>
-          <w:rFonts w:ascii="Arial" w:hAnsi="Arial"/>
-          <w:b w:val="0"/>
-          <w:i w:val="0"/>
-          <w:sz w:val="24"/>
-        </w:rPr>
-        <w:t>Git.</w:t>
-      </w:r>
-    </w:p>
-    <w:p/>
-    <w:p>
-      <w:pPr>
-        <w:spacing w:before="120" w:after="60" w:line="360" w:lineRule="auto"/>
-        <w:ind w:firstLine="0"/>
-        <w:jc w:val="left"/>
-      </w:pPr>
-      <w:r>
-        <w:rPr>
-          <w:rFonts w:ascii="Arial" w:hAnsi="Arial"/>
-          <w:b/>
-          <w:sz w:val="24"/>
-        </w:rPr>
-        <w:t>7.2 Passos para Execução</w:t>
-      </w:r>
-    </w:p>
-    <w:p>
-      <w:pPr>
-        <w:spacing w:before="0" w:after="0" w:line="360" w:lineRule="auto"/>
-        <w:ind w:left="709"/>
-        <w:jc w:val="both"/>
       </w:pPr>
       <w:r>
         <w:rPr>
@@ -3459,13 +2345,15 @@
     </w:p>
     <w:p>
       <w:pPr>
-        <w:spacing w:before="60" w:after="60" w:line="360" w:lineRule="auto"/>
-        <w:ind w:firstLine="0" w:left="709"/>
+        <w:spacing w:before="0" w:after="0" w:line="240" w:lineRule="auto"/>
+        <w:ind w:firstLine="0" w:left="1134"/>
         <w:jc w:val="left"/>
       </w:pPr>
       <w:r>
         <w:rPr>
           <w:rFonts w:ascii="Courier New" w:hAnsi="Courier New"/>
+          <w:b w:val="0"/>
+          <w:i w:val="0"/>
           <w:sz w:val="20"/>
         </w:rPr>
         <w:t>git clone https://github.com/Jvcamargo1/Supermath.git</w:t>
@@ -3475,9 +2363,9 @@
     </w:p>
     <w:p>
       <w:pPr>
-        <w:spacing w:before="0" w:after="0" w:line="360" w:lineRule="auto"/>
-        <w:ind w:left="709"/>
-        <w:jc w:val="both"/>
+        <w:spacing w:before="120" w:after="0" w:line="360" w:lineRule="auto"/>
+        <w:ind w:firstLine="0" w:left="709"/>
+        <w:jc w:val="left"/>
       </w:pPr>
       <w:r>
         <w:rPr>
@@ -3491,27 +2379,29 @@
     </w:p>
     <w:p>
       <w:pPr>
-        <w:spacing w:before="60" w:after="60" w:line="360" w:lineRule="auto"/>
-        <w:ind w:firstLine="0" w:left="709"/>
+        <w:spacing w:before="0" w:after="0" w:line="240" w:lineRule="auto"/>
+        <w:ind w:firstLine="0" w:left="1134"/>
         <w:jc w:val="left"/>
       </w:pPr>
       <w:r>
         <w:rPr>
           <w:rFonts w:ascii="Courier New" w:hAnsi="Courier New"/>
+          <w:b w:val="0"/>
+          <w:i w:val="0"/>
           <w:sz w:val="20"/>
         </w:rPr>
         <w:t>python -m venv venv</w:t>
         <w:br/>
-        <w:t>venv\Scripts\activate          (Windows)</w:t>
+        <w:t>venv\Scripts\activate        (Windows)</w:t>
         <w:br/>
-        <w:t>source venv/bin/activate        (Linux/macOS)</w:t>
+        <w:t>source venv/bin/activate       (Linux/macOS)</w:t>
       </w:r>
     </w:p>
     <w:p>
       <w:pPr>
-        <w:spacing w:before="0" w:after="0" w:line="360" w:lineRule="auto"/>
-        <w:ind w:left="709"/>
-        <w:jc w:val="both"/>
+        <w:spacing w:before="120" w:after="0" w:line="360" w:lineRule="auto"/>
+        <w:ind w:firstLine="0" w:left="709"/>
+        <w:jc w:val="left"/>
       </w:pPr>
       <w:r>
         <w:rPr>
@@ -3525,13 +2415,15 @@
     </w:p>
     <w:p>
       <w:pPr>
-        <w:spacing w:before="60" w:after="60" w:line="360" w:lineRule="auto"/>
-        <w:ind w:firstLine="0" w:left="709"/>
+        <w:spacing w:before="0" w:after="0" w:line="240" w:lineRule="auto"/>
+        <w:ind w:firstLine="0" w:left="1134"/>
         <w:jc w:val="left"/>
       </w:pPr>
       <w:r>
         <w:rPr>
           <w:rFonts w:ascii="Courier New" w:hAnsi="Courier New"/>
+          <w:b w:val="0"/>
+          <w:i w:val="0"/>
           <w:sz w:val="20"/>
         </w:rPr>
         <w:t>pip install -r requirements.txt</w:t>
@@ -3539,9 +2431,9 @@
     </w:p>
     <w:p>
       <w:pPr>
-        <w:spacing w:before="0" w:after="0" w:line="360" w:lineRule="auto"/>
-        <w:ind w:left="709"/>
-        <w:jc w:val="both"/>
+        <w:spacing w:before="120" w:after="0" w:line="360" w:lineRule="auto"/>
+        <w:ind w:firstLine="0" w:left="709"/>
+        <w:jc w:val="left"/>
       </w:pPr>
       <w:r>
         <w:rPr>
@@ -3555,27 +2447,29 @@
     </w:p>
     <w:p>
       <w:pPr>
-        <w:spacing w:before="60" w:after="60" w:line="360" w:lineRule="auto"/>
-        <w:ind w:firstLine="0" w:left="709"/>
+        <w:spacing w:before="0" w:after="0" w:line="240" w:lineRule="auto"/>
+        <w:ind w:firstLine="0" w:left="1134"/>
         <w:jc w:val="left"/>
       </w:pPr>
       <w:r>
         <w:rPr>
           <w:rFonts w:ascii="Courier New" w:hAnsi="Courier New"/>
+          <w:b w:val="0"/>
+          <w:i w:val="0"/>
           <w:sz w:val="20"/>
         </w:rPr>
-        <w:t># Acesse https://console.groq.com/keys, crie uma conta gratuita e gere uma chave.</w:t>
+        <w:t># Crie uma conta gratuita em https://console.groq.com/keys</w:t>
         <w:br/>
-        <w:t># Renomeie o arquivo .env.example para .env e insira a chave:</w:t>
+        <w:t># Renomeie .env.example para .env e insira:</w:t>
         <w:br/>
-        <w:t>GROQ_API_KEY=sua_chave_api_aqui</w:t>
+        <w:t>GROQ_API_KEY=sua_chave_aqui</w:t>
       </w:r>
     </w:p>
     <w:p>
       <w:pPr>
-        <w:spacing w:before="0" w:after="0" w:line="360" w:lineRule="auto"/>
-        <w:ind w:left="709"/>
-        <w:jc w:val="both"/>
+        <w:spacing w:before="120" w:after="0" w:line="360" w:lineRule="auto"/>
+        <w:ind w:firstLine="0" w:left="709"/>
+        <w:jc w:val="left"/>
       </w:pPr>
       <w:r>
         <w:rPr>
@@ -3584,23 +2478,25 @@
           <w:i w:val="0"/>
           <w:sz w:val="24"/>
         </w:rPr>
-        <w:t>Passo 5 — Executar a aplicação:</w:t>
+        <w:t>Passo 5 — Executar:</w:t>
       </w:r>
     </w:p>
     <w:p>
       <w:pPr>
-        <w:spacing w:before="60" w:after="60" w:line="360" w:lineRule="auto"/>
-        <w:ind w:firstLine="0" w:left="709"/>
+        <w:spacing w:before="0" w:after="0" w:line="240" w:lineRule="auto"/>
+        <w:ind w:firstLine="0" w:left="1134"/>
         <w:jc w:val="left"/>
       </w:pPr>
       <w:r>
         <w:rPr>
           <w:rFonts w:ascii="Courier New" w:hAnsi="Courier New"/>
+          <w:b w:val="0"/>
+          <w:i w:val="0"/>
           <w:sz w:val="20"/>
         </w:rPr>
         <w:t>streamlit run app.py</w:t>
         <w:br/>
-        <w:t># Acesse no navegador: http://localhost:8501</w:t>
+        <w:t># Acesse: http://localhost:8501</w:t>
       </w:r>
     </w:p>
     <w:p>
@@ -3610,7 +2506,7 @@
     </w:p>
     <w:p>
       <w:pPr>
-        <w:spacing w:before="240" w:after="120" w:line="360" w:lineRule="auto"/>
+        <w:spacing w:before="360" w:after="120" w:line="360" w:lineRule="auto"/>
         <w:ind w:firstLine="0"/>
         <w:jc w:val="left"/>
       </w:pPr>
@@ -3618,15 +2514,16 @@
         <w:rPr>
           <w:rFonts w:ascii="Arial" w:hAnsi="Arial"/>
           <w:b/>
+          <w:i w:val="0"/>
           <w:sz w:val="24"/>
         </w:rPr>
-        <w:t>8 EQUIPE DE DESENVOLVIMENTO</w:t>
+        <w:t>9 EQUIPE DE DESENVOLVIMENTO</w:t>
       </w:r>
     </w:p>
     <w:p>
       <w:pPr>
         <w:spacing w:before="0" w:after="0" w:line="360" w:lineRule="auto"/>
-        <w:ind w:left="709"/>
+        <w:ind w:firstLine="0" w:left="709"/>
         <w:jc w:val="both"/>
       </w:pPr>
       <w:r>
@@ -3645,13 +2542,13 @@
           <w:i w:val="0"/>
           <w:sz w:val="24"/>
         </w:rPr>
-        <w:t>Design, desenvolvimento de funcionalidades, testes e UX/UI.</w:t>
+        <w:t>Design, funcionalidades, testes e UX/UI.</w:t>
       </w:r>
     </w:p>
     <w:p>
       <w:pPr>
         <w:spacing w:before="0" w:after="0" w:line="360" w:lineRule="auto"/>
-        <w:ind w:left="709"/>
+        <w:ind w:firstLine="0" w:left="709"/>
         <w:jc w:val="both"/>
       </w:pPr>
       <w:r>
@@ -3670,13 +2567,13 @@
           <w:i w:val="0"/>
           <w:sz w:val="24"/>
         </w:rPr>
-        <w:t>Design, desenvolvimento de funcionalidades, testes e UX/UI.</w:t>
+        <w:t>Design, funcionalidades, testes e UX/UI.</w:t>
       </w:r>
     </w:p>
     <w:p>
       <w:pPr>
         <w:spacing w:before="0" w:after="0" w:line="360" w:lineRule="auto"/>
-        <w:ind w:left="709"/>
+        <w:ind w:firstLine="0" w:left="709"/>
         <w:jc w:val="both"/>
       </w:pPr>
       <w:r>
@@ -3695,13 +2592,13 @@
           <w:i w:val="0"/>
           <w:sz w:val="24"/>
         </w:rPr>
-        <w:t>Arquitetura do sistema, desenvolvimento frontend e backend, e design.</w:t>
+        <w:t>Arquitetura, desenvolvimento frontend e backend, e design.</w:t>
       </w:r>
     </w:p>
     <w:p>
       <w:pPr>
         <w:spacing w:before="0" w:after="0" w:line="360" w:lineRule="auto"/>
-        <w:ind w:left="709"/>
+        <w:ind w:firstLine="0" w:left="709"/>
         <w:jc w:val="both"/>
       </w:pPr>
       <w:r>
@@ -3726,7 +2623,7 @@
     <w:p>
       <w:pPr>
         <w:spacing w:before="0" w:after="0" w:line="360" w:lineRule="auto"/>
-        <w:ind w:left="709"/>
+        <w:ind w:firstLine="0" w:left="709"/>
         <w:jc w:val="both"/>
       </w:pPr>
       <w:r>
@@ -3755,7 +2652,7 @@
     </w:p>
     <w:p>
       <w:pPr>
-        <w:spacing w:before="240" w:after="120" w:line="360" w:lineRule="auto"/>
+        <w:spacing w:before="360" w:after="120" w:line="360" w:lineRule="auto"/>
         <w:ind w:firstLine="0"/>
         <w:jc w:val="left"/>
       </w:pPr>
@@ -3763,6 +2660,7 @@
         <w:rPr>
           <w:rFonts w:ascii="Arial" w:hAnsi="Arial"/>
           <w:b/>
+          <w:i w:val="0"/>
           <w:sz w:val="24"/>
         </w:rPr>
         <w:t>REFERÊNCIAS</w:t>
@@ -3777,20 +2675,8 @@
       <w:r>
         <w:rPr>
           <w:rFonts w:ascii="Arial" w:hAnsi="Arial"/>
-          <w:sz w:val="24"/>
-        </w:rPr>
-        <w:t>BURDEN, Richard L.; FAIRES, J. Douglas. Análise Numérica. 8. ed. São Paulo: Cengage Learning, 2008.</w:t>
-      </w:r>
-    </w:p>
-    <w:p>
-      <w:pPr>
-        <w:spacing w:before="120" w:after="0" w:line="360" w:lineRule="auto"/>
-        <w:ind w:firstLine="0" w:left="0"/>
-        <w:jc w:val="both"/>
-      </w:pPr>
-      <w:r>
-        <w:rPr>
-          <w:rFonts w:ascii="Arial" w:hAnsi="Arial"/>
+          <w:b w:val="0"/>
+          <w:i w:val="0"/>
           <w:sz w:val="24"/>
         </w:rPr>
         <w:t>GROQ. Groq API Documentation. Disponível em: https://console.groq.com/docs. Acesso em: maio 2025.</w:t>
@@ -3805,9 +2691,11 @@
       <w:r>
         <w:rPr>
           <w:rFonts w:ascii="Arial" w:hAnsi="Arial"/>
+          <w:b w:val="0"/>
+          <w:i w:val="0"/>
           <w:sz w:val="24"/>
         </w:rPr>
-        <w:t>META AI. Llama 3.3 70B: Large Language Model. Disponível em: https://ai.meta.com/blog/llama-3-3/. Acesso em: maio 2025.</w:t>
+        <w:t>META AI. Llama 3.3 70B. Disponível em: https://ai.meta.com/blog/llama-3-3/. Acesso em: maio 2025.</w:t>
       </w:r>
     </w:p>
     <w:p>
@@ -3819,6 +2707,8 @@
       <w:r>
         <w:rPr>
           <w:rFonts w:ascii="Arial" w:hAnsi="Arial"/>
+          <w:b w:val="0"/>
+          <w:i w:val="0"/>
           <w:sz w:val="24"/>
         </w:rPr>
         <w:t>STREAMLIT. Streamlit Documentation. Disponível em: https://docs.streamlit.io. Acesso em: maio 2025.</w:t>
@@ -3833,20 +2723,8 @@
       <w:r>
         <w:rPr>
           <w:rFonts w:ascii="Arial" w:hAnsi="Arial"/>
-          <w:sz w:val="24"/>
-        </w:rPr>
-        <w:t>CHAPRA, Steven C.; CANALE, Raymond P. Métodos Numéricos para Engenharia. 7. ed. Porto Alegre: AMGH, 2016.</w:t>
-      </w:r>
-    </w:p>
-    <w:p>
-      <w:pPr>
-        <w:spacing w:before="120" w:after="0" w:line="360" w:lineRule="auto"/>
-        <w:ind w:firstLine="0" w:left="0"/>
-        <w:jc w:val="both"/>
-      </w:pPr>
-      <w:r>
-        <w:rPr>
-          <w:rFonts w:ascii="Arial" w:hAnsi="Arial"/>
+          <w:b w:val="0"/>
+          <w:i w:val="0"/>
           <w:sz w:val="24"/>
         </w:rPr>
         <w:t>ASSOCIAÇÃO BRASILEIRA DE NORMAS TÉCNICAS. NBR 14724: Informação e documentação — Trabalhos acadêmicos — Apresentação. Rio de Janeiro: ABNT, 2011.</w:t>

</xml_diff>